<commit_message>
fix de carpeta final
</commit_message>
<xml_diff>
--- a/documentos/presentacion final/Softvet - Carpeta presentacion.docx
+++ b/documentos/presentacion final/Softvet - Carpeta presentacion.docx
@@ -1,9 +1,10 @@
 
 <file path=word/document.xml><?xml version="1.0" encoding="utf-8"?>
-<w:document xmlns:wpc="http://schemas.microsoft.com/office/word/2010/wordprocessingCanvas" xmlns:cx="http://schemas.microsoft.com/office/drawing/2014/chartex" xmlns:mc="http://schemas.openxmlformats.org/markup-compatibility/2006" xmlns:o="urn:schemas-microsoft-com:office:office" xmlns:r="http://schemas.openxmlformats.org/officeDocument/2006/relationships" xmlns:m="http://schemas.openxmlformats.org/officeDocument/2006/math" xmlns:v="urn:schemas-microsoft-com:vml" xmlns:wp14="http://schemas.microsoft.com/office/word/2010/wordprocessingDrawing" xmlns:wp="http://schemas.openxmlformats.org/drawingml/2006/wordprocessingDrawing" xmlns:w10="urn:schemas-microsoft-com:office:word" xmlns:w="http://schemas.openxmlformats.org/wordprocessingml/2006/main" xmlns:w14="http://schemas.microsoft.com/office/word/2010/wordml" xmlns:w15="http://schemas.microsoft.com/office/word/2012/wordml" xmlns:w16se="http://schemas.microsoft.com/office/word/2015/wordml/symex" xmlns:wpg="http://schemas.microsoft.com/office/word/2010/wordprocessingGroup" xmlns:wpi="http://schemas.microsoft.com/office/word/2010/wordprocessingInk" xmlns:wne="http://schemas.microsoft.com/office/word/2006/wordml" xmlns:wps="http://schemas.microsoft.com/office/word/2010/wordprocessingShape" mc:Ignorable="w14 w15 w16se wp14">
+<w:document xmlns:wpc="http://schemas.microsoft.com/office/word/2010/wordprocessingCanvas" xmlns:cx="http://schemas.microsoft.com/office/drawing/2014/chartex" xmlns:cx1="http://schemas.microsoft.com/office/drawing/2015/9/8/chartex" xmlns:cx2="http://schemas.microsoft.com/office/drawing/2015/10/21/chartex" xmlns:cx3="http://schemas.microsoft.com/office/drawing/2016/5/9/chartex" xmlns:cx4="http://schemas.microsoft.com/office/drawing/2016/5/10/chartex" xmlns:cx5="http://schemas.microsoft.com/office/drawing/2016/5/11/chartex" xmlns:cx6="http://schemas.microsoft.com/office/drawing/2016/5/12/chartex" xmlns:cx7="http://schemas.microsoft.com/office/drawing/2016/5/13/chartex" xmlns:cx8="http://schemas.microsoft.com/office/drawing/2016/5/14/chartex" xmlns:mc="http://schemas.openxmlformats.org/markup-compatibility/2006" xmlns:aink="http://schemas.microsoft.com/office/drawing/2016/ink" xmlns:am3d="http://schemas.microsoft.com/office/drawing/2017/model3d" xmlns:o="urn:schemas-microsoft-com:office:office" xmlns:r="http://schemas.openxmlformats.org/officeDocument/2006/relationships" xmlns:m="http://schemas.openxmlformats.org/officeDocument/2006/math" xmlns:v="urn:schemas-microsoft-com:vml" xmlns:wp14="http://schemas.microsoft.com/office/word/2010/wordprocessingDrawing" xmlns:wp="http://schemas.openxmlformats.org/drawingml/2006/wordprocessingDrawing" xmlns:w10="urn:schemas-microsoft-com:office:word" xmlns:w="http://schemas.openxmlformats.org/wordprocessingml/2006/main" xmlns:w14="http://schemas.microsoft.com/office/word/2010/wordml" xmlns:w15="http://schemas.microsoft.com/office/word/2012/wordml" xmlns:w16cex="http://schemas.microsoft.com/office/word/2018/wordml/cex" xmlns:w16cid="http://schemas.microsoft.com/office/word/2016/wordml/cid" xmlns:w16="http://schemas.microsoft.com/office/word/2018/wordml" xmlns:w16sdtdh="http://schemas.microsoft.com/office/word/2020/wordml/sdtdatahash" xmlns:w16se="http://schemas.microsoft.com/office/word/2015/wordml/symex" xmlns:wpg="http://schemas.microsoft.com/office/word/2010/wordprocessingGroup" xmlns:wpi="http://schemas.microsoft.com/office/word/2010/wordprocessingInk" xmlns:wne="http://schemas.microsoft.com/office/word/2006/wordml" xmlns:wps="http://schemas.microsoft.com/office/word/2010/wordprocessingShape" mc:Ignorable="w14 w15 w16se w16cid w16 w16cex w16sdtdh wp14">
   <w:body>
     <w:p>
       <w:pPr>
+        <w:pStyle w:val="Ttulo3"/>
         <w:rPr>
           <w:lang w:val="es-ES"/>
         </w:rPr>
@@ -11,10 +12,10 @@
       <w:r>
         <w:rPr>
           <w:noProof/>
-          <w:lang w:val="es-ES" w:eastAsia="es-ES"/>
+          <w:lang w:val="es-ES"/>
         </w:rPr>
         <w:drawing>
-          <wp:anchor distT="0" distB="0" distL="114300" distR="114300" simplePos="0" relativeHeight="251662336" behindDoc="0" locked="0" layoutInCell="1" allowOverlap="1" wp14:anchorId="7302FAFF" wp14:editId="54640B76">
+          <wp:anchor distT="0" distB="0" distL="114300" distR="114300" simplePos="0" relativeHeight="251662336" behindDoc="0" locked="0" layoutInCell="1" allowOverlap="1" wp14:anchorId="3D8EA543" wp14:editId="2466CEE3">
             <wp:simplePos x="0" y="0"/>
             <wp:positionH relativeFrom="margin">
               <wp:posOffset>1143635</wp:posOffset>
@@ -72,12 +73,12 @@
       <w:r>
         <w:rPr>
           <w:noProof/>
-          <w:lang w:val="es-ES" w:eastAsia="es-ES"/>
+          <w:lang w:val="es-ES"/>
         </w:rPr>
         <mc:AlternateContent>
           <mc:Choice Requires="wps">
             <w:drawing>
-              <wp:anchor distT="0" distB="0" distL="114300" distR="114300" simplePos="0" relativeHeight="251664384" behindDoc="1" locked="0" layoutInCell="1" allowOverlap="1" wp14:anchorId="7F133DEC" wp14:editId="203B9181">
+              <wp:anchor distT="0" distB="0" distL="114300" distR="114300" simplePos="0" relativeHeight="251664384" behindDoc="1" locked="0" layoutInCell="1" allowOverlap="1" wp14:anchorId="171BA240" wp14:editId="1A2C252E">
                 <wp:simplePos x="0" y="0"/>
                 <wp:positionH relativeFrom="margin">
                   <wp:align>center</wp:align>
@@ -172,7 +173,7 @@
         <mc:AlternateContent>
           <mc:Choice Requires="wps">
             <w:drawing>
-              <wp:anchor distT="0" distB="0" distL="114300" distR="114300" simplePos="0" relativeHeight="251661312" behindDoc="0" locked="0" layoutInCell="1" allowOverlap="1" wp14:anchorId="0898E928" wp14:editId="6D355BA6">
+              <wp:anchor distT="0" distB="0" distL="114300" distR="114300" simplePos="0" relativeHeight="251661312" behindDoc="0" locked="0" layoutInCell="1" allowOverlap="1" wp14:anchorId="2A9B0478" wp14:editId="18073042">
                 <wp:simplePos x="0" y="0"/>
                 <wp:positionH relativeFrom="column">
                   <wp:posOffset>4012252</wp:posOffset>
@@ -268,7 +269,7 @@
           </mc:Choice>
           <mc:Fallback>
             <w:pict>
-              <v:oval w14:anchorId="0898E928" id="Elipse 10" o:spid="_x0000_s1026" style="position:absolute;margin-left:315.95pt;margin-top:8pt;width:58.2pt;height:58.2pt;z-index:251661312;visibility:visible;mso-wrap-style:square;mso-width-percent:0;mso-height-percent:0;mso-wrap-distance-left:9pt;mso-wrap-distance-top:0;mso-wrap-distance-right:9pt;mso-wrap-distance-bottom:0;mso-position-horizontal:absolute;mso-position-horizontal-relative:text;mso-position-vertical:absolute;mso-position-vertical-relative:text;mso-width-percent:0;mso-height-percent:0;mso-width-relative:margin;mso-height-relative:margin;v-text-anchor:middle" o:gfxdata="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" fillcolor="#f6c" strokecolor="#f2f2f2 [3052]" strokeweight="2.25pt">
+              <v:oval w14:anchorId="2A9B0478" id="Elipse 10" o:spid="_x0000_s1026" style="position:absolute;margin-left:315.95pt;margin-top:8pt;width:58.2pt;height:58.2pt;z-index:251661312;visibility:visible;mso-wrap-style:square;mso-width-percent:0;mso-height-percent:0;mso-wrap-distance-left:9pt;mso-wrap-distance-top:0;mso-wrap-distance-right:9pt;mso-wrap-distance-bottom:0;mso-position-horizontal:absolute;mso-position-horizontal-relative:text;mso-position-vertical:absolute;mso-position-vertical-relative:text;mso-width-percent:0;mso-height-percent:0;mso-width-relative:margin;mso-height-relative:margin;v-text-anchor:middle" o:gfxdata="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" fillcolor="#f6c" strokecolor="#f2f2f2 [3052]" strokeweight="2.25pt">
                 <v:stroke joinstyle="miter"/>
                 <v:textbox>
                   <w:txbxContent>
@@ -316,7 +317,7 @@
         <mc:AlternateContent>
           <mc:Choice Requires="wps">
             <w:drawing>
-              <wp:anchor distT="0" distB="0" distL="114300" distR="114300" simplePos="0" relativeHeight="251660288" behindDoc="0" locked="0" layoutInCell="1" allowOverlap="1" wp14:anchorId="7385C8D5" wp14:editId="6E7698F9">
+              <wp:anchor distT="0" distB="0" distL="114300" distR="114300" simplePos="0" relativeHeight="251660288" behindDoc="0" locked="0" layoutInCell="1" allowOverlap="1" wp14:anchorId="66D32473" wp14:editId="4D2A2CC3">
                 <wp:simplePos x="0" y="0"/>
                 <wp:positionH relativeFrom="margin">
                   <wp:align>center</wp:align>
@@ -450,7 +451,7 @@
           </mc:Choice>
           <mc:Fallback>
             <w:pict>
-              <v:roundrect w14:anchorId="7385C8D5" id="Rectángulo redondeado 60" o:spid="_x0000_s1027" style="position:absolute;margin-left:0;margin-top:.65pt;width:312.5pt;height:312.5pt;z-index:251660288;visibility:visible;mso-wrap-style:square;mso-wrap-distance-left:9pt;mso-wrap-distance-top:0;mso-wrap-distance-right:9pt;mso-wrap-distance-bottom:0;mso-position-horizontal:center;mso-position-horizontal-relative:margin;mso-position-vertical:absolute;mso-position-vertical-relative:text;v-text-anchor:middle" arcsize="10923f" o:gfxdata="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" fillcolor="#96f" strokecolor="#1f4d78 [1604]" strokeweight="1pt">
+              <v:roundrect w14:anchorId="66D32473" id="Rectángulo redondeado 60" o:spid="_x0000_s1027" style="position:absolute;margin-left:0;margin-top:.65pt;width:312.5pt;height:312.5pt;z-index:251660288;visibility:visible;mso-wrap-style:square;mso-wrap-distance-left:9pt;mso-wrap-distance-top:0;mso-wrap-distance-right:9pt;mso-wrap-distance-bottom:0;mso-position-horizontal:center;mso-position-horizontal-relative:margin;mso-position-vertical:absolute;mso-position-vertical-relative:text;v-text-anchor:middle" arcsize="10923f" o:gfxdata="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" fillcolor="#96f" strokecolor="#1f4d78 [1604]" strokeweight="1pt">
                 <v:stroke joinstyle="miter"/>
                 <v:textbox>
                   <w:txbxContent>
@@ -809,7 +810,7 @@
           <w:lang w:val="es-ES" w:eastAsia="es-ES"/>
         </w:rPr>
         <w:drawing>
-          <wp:anchor distT="0" distB="0" distL="114300" distR="114300" simplePos="0" relativeHeight="251663360" behindDoc="0" locked="0" layoutInCell="1" allowOverlap="1" wp14:anchorId="304622DA" wp14:editId="0DB3DA9E">
+          <wp:anchor distT="0" distB="0" distL="114300" distR="114300" simplePos="0" relativeHeight="251663360" behindDoc="0" locked="0" layoutInCell="1" allowOverlap="1" wp14:anchorId="66041EA3" wp14:editId="47183F56">
             <wp:simplePos x="0" y="0"/>
             <wp:positionH relativeFrom="margin">
               <wp:posOffset>3518829</wp:posOffset>
@@ -1126,6 +1127,7 @@
       </w:sdtPr>
       <w:sdtEndPr>
         <w:rPr>
+          <w:b w:val="0"/>
           <w:bCs/>
           <w:lang w:val="es-AR"/>
         </w:rPr>
@@ -1170,51 +1172,14 @@
                 <w:rStyle w:val="Hipervnculo"/>
                 <w:noProof/>
               </w:rPr>
-              <w:t>2</w:t>
-            </w:r>
-            <w:bookmarkStart w:id="1" w:name="_GoBack"/>
-            <w:bookmarkEnd w:id="1"/>
+              <w:t>2.</w:t>
+            </w:r>
             <w:r>
               <w:rPr>
                 <w:rStyle w:val="Hipervnculo"/>
                 <w:noProof/>
               </w:rPr>
-              <w:t>.</w:t>
-            </w:r>
-            <w:r>
-              <w:rPr>
-                <w:rStyle w:val="Hipervnculo"/>
-                <w:noProof/>
-              </w:rPr>
-              <w:t>Co</w:t>
-            </w:r>
-            <w:r>
-              <w:rPr>
-                <w:rStyle w:val="Hipervnculo"/>
-                <w:noProof/>
-              </w:rPr>
-              <w:t>n</w:t>
-            </w:r>
-            <w:r>
-              <w:rPr>
-                <w:rStyle w:val="Hipervnculo"/>
-                <w:noProof/>
-              </w:rPr>
-              <w:t>t</w:t>
-            </w:r>
-            <w:r>
-              <w:rPr>
-                <w:rStyle w:val="Hipervnculo"/>
-                <w:noProof/>
-              </w:rPr>
-              <w:t>e</w:t>
-            </w:r>
-            <w:r>
-              <w:rPr>
-                <w:rStyle w:val="Hipervnculo"/>
-                <w:noProof/>
-              </w:rPr>
-              <w:t>nido</w:t>
+              <w:t>Contenido</w:t>
             </w:r>
             <w:r>
               <w:rPr>
@@ -2143,7 +2108,21 @@
                 <w:rStyle w:val="Hipervnculo"/>
                 <w:noProof/>
               </w:rPr>
-              <w:t>5.1 Contexto tecnológico actual</w:t>
+              <w:t>5.1 Contexto t</w:t>
+            </w:r>
+            <w:r>
+              <w:rPr>
+                <w:rStyle w:val="Hipervnculo"/>
+                <w:noProof/>
+              </w:rPr>
+              <w:t>e</w:t>
+            </w:r>
+            <w:r>
+              <w:rPr>
+                <w:rStyle w:val="Hipervnculo"/>
+                <w:noProof/>
+              </w:rPr>
+              <w:t>cnológico actual</w:t>
             </w:r>
             <w:r>
               <w:rPr>
@@ -8484,7 +8463,7 @@
                 <w:noProof/>
                 <w:webHidden/>
               </w:rPr>
-              <w:t>46</w:t>
+              <w:t>45</w:t>
             </w:r>
             <w:r>
               <w:rPr>
@@ -10202,7 +10181,7 @@
           <w:lang w:eastAsia="es-AR"/>
         </w:rPr>
       </w:pPr>
-      <w:bookmarkStart w:id="2" w:name="_Toc228797126"/>
+      <w:bookmarkStart w:id="1" w:name="_Toc228797126"/>
       <w:r>
         <w:rPr>
           <w:rFonts w:eastAsia="Times New Roman"/>
@@ -10211,7 +10190,7 @@
         <w:lastRenderedPageBreak/>
         <w:t>3. RESUMEN EJECUTIVO</w:t>
       </w:r>
-      <w:bookmarkEnd w:id="2"/>
+      <w:bookmarkEnd w:id="1"/>
     </w:p>
     <w:p>
       <w:pPr>
@@ -10221,7 +10200,7 @@
           <w:lang w:eastAsia="es-AR"/>
         </w:rPr>
       </w:pPr>
-      <w:bookmarkStart w:id="3" w:name="_Toc228797127"/>
+      <w:bookmarkStart w:id="2" w:name="_Toc228797127"/>
       <w:r>
         <w:rPr>
           <w:rFonts w:eastAsia="Times New Roman"/>
@@ -10229,7 +10208,7 @@
         </w:rPr>
         <w:t>3.1 Breve descripción del proyecto</w:t>
       </w:r>
-      <w:bookmarkEnd w:id="3"/>
+      <w:bookmarkEnd w:id="2"/>
     </w:p>
     <w:p>
       <w:pPr>
@@ -10321,7 +10300,7 @@
           <w:lang w:eastAsia="es-AR"/>
         </w:rPr>
       </w:pPr>
-      <w:bookmarkStart w:id="4" w:name="_Toc228797128"/>
+      <w:bookmarkStart w:id="3" w:name="_Toc228797128"/>
       <w:r>
         <w:rPr>
           <w:rFonts w:eastAsia="Times New Roman"/>
@@ -10329,7 +10308,7 @@
         </w:rPr>
         <w:t>3.2 Objetivos principales</w:t>
       </w:r>
-      <w:bookmarkEnd w:id="4"/>
+      <w:bookmarkEnd w:id="3"/>
     </w:p>
     <w:p>
       <w:pPr>
@@ -10483,7 +10462,7 @@
           <w:lang w:eastAsia="es-AR"/>
         </w:rPr>
       </w:pPr>
-      <w:bookmarkStart w:id="5" w:name="_Toc228797129"/>
+      <w:bookmarkStart w:id="4" w:name="_Toc228797129"/>
       <w:r>
         <w:rPr>
           <w:rFonts w:eastAsia="Times New Roman"/>
@@ -10491,7 +10470,7 @@
         </w:rPr>
         <w:t>3.3 Metodología utilizada</w:t>
       </w:r>
-      <w:bookmarkEnd w:id="5"/>
+      <w:bookmarkEnd w:id="4"/>
     </w:p>
     <w:p>
       <w:pPr>
@@ -10692,7 +10671,7 @@
           <w:lang w:eastAsia="es-AR"/>
         </w:rPr>
       </w:pPr>
-      <w:bookmarkStart w:id="6" w:name="_Toc228797130"/>
+      <w:bookmarkStart w:id="5" w:name="_Toc228797130"/>
       <w:r>
         <w:rPr>
           <w:rFonts w:eastAsia="Times New Roman"/>
@@ -10703,7 +10682,7 @@
       <w:r>
         <w:t>esperados</w:t>
       </w:r>
-      <w:bookmarkEnd w:id="6"/>
+      <w:bookmarkEnd w:id="5"/>
     </w:p>
     <w:p>
       <w:pPr>
@@ -10824,7 +10803,7 @@
           <w:lang w:eastAsia="es-AR"/>
         </w:rPr>
       </w:pPr>
-      <w:bookmarkStart w:id="7" w:name="_Toc228797131"/>
+      <w:bookmarkStart w:id="6" w:name="_Toc228797131"/>
       <w:r>
         <w:rPr>
           <w:rFonts w:eastAsia="Times New Roman"/>
@@ -10832,7 +10811,7 @@
         </w:rPr>
         <w:t>3.5 Conclusiones generales</w:t>
       </w:r>
-      <w:bookmarkEnd w:id="7"/>
+      <w:bookmarkEnd w:id="6"/>
     </w:p>
     <w:p>
       <w:pPr>
@@ -10887,21 +10866,21 @@
       <w:pPr>
         <w:pStyle w:val="Ttulo1"/>
       </w:pPr>
-      <w:bookmarkStart w:id="8" w:name="_Toc228797132"/>
+      <w:bookmarkStart w:id="7" w:name="_Toc228797132"/>
       <w:r>
         <w:t>4. INTRODUCCIÓN</w:t>
       </w:r>
+      <w:bookmarkEnd w:id="7"/>
+    </w:p>
+    <w:p>
+      <w:pPr>
+        <w:pStyle w:val="Ttulo2"/>
+      </w:pPr>
+      <w:bookmarkStart w:id="8" w:name="_Toc228797133"/>
+      <w:r>
+        <w:t>4.1 Contexto y antecedentes</w:t>
+      </w:r>
       <w:bookmarkEnd w:id="8"/>
-    </w:p>
-    <w:p>
-      <w:pPr>
-        <w:pStyle w:val="Ttulo2"/>
-      </w:pPr>
-      <w:bookmarkStart w:id="9" w:name="_Toc228797133"/>
-      <w:r>
-        <w:t>4.1 Contexto y antecedentes</w:t>
-      </w:r>
-      <w:bookmarkEnd w:id="9"/>
     </w:p>
     <w:p>
       <w:pPr>
@@ -10935,12 +10914,12 @@
       <w:pPr>
         <w:pStyle w:val="Ttulo2"/>
       </w:pPr>
-      <w:bookmarkStart w:id="10" w:name="_Toc228797134"/>
+      <w:bookmarkStart w:id="9" w:name="_Toc228797134"/>
       <w:r>
         <w:lastRenderedPageBreak/>
         <w:t>4.2 Justificación</w:t>
       </w:r>
-      <w:bookmarkEnd w:id="10"/>
+      <w:bookmarkEnd w:id="9"/>
     </w:p>
     <w:p>
       <w:r>
@@ -11047,11 +11026,11 @@
       <w:pPr>
         <w:pStyle w:val="Ttulo2"/>
       </w:pPr>
-      <w:bookmarkStart w:id="11" w:name="_Toc228797135"/>
+      <w:bookmarkStart w:id="10" w:name="_Toc228797135"/>
       <w:r>
         <w:t>4.3 Objetivo General</w:t>
       </w:r>
-      <w:bookmarkEnd w:id="11"/>
+      <w:bookmarkEnd w:id="10"/>
     </w:p>
     <w:p>
       <w:pPr>
@@ -11076,7 +11055,7 @@
       <w:pPr>
         <w:pStyle w:val="Ttulo3"/>
       </w:pPr>
-      <w:bookmarkStart w:id="12" w:name="_Toc228797136"/>
+      <w:bookmarkStart w:id="11" w:name="_Toc228797136"/>
       <w:r>
         <w:t>4.3.1</w:t>
       </w:r>
@@ -11086,7 +11065,7 @@
       <w:r>
         <w:t>Específicos</w:t>
       </w:r>
-      <w:bookmarkEnd w:id="12"/>
+      <w:bookmarkEnd w:id="11"/>
     </w:p>
     <w:p>
       <w:pPr>
@@ -11226,21 +11205,21 @@
       <w:pPr>
         <w:pStyle w:val="Ttulo1"/>
       </w:pPr>
-      <w:bookmarkStart w:id="13" w:name="_Toc228797137"/>
+      <w:bookmarkStart w:id="12" w:name="_Toc228797137"/>
       <w:r>
         <w:t>5. ESTADO DEL ARTE</w:t>
       </w:r>
+      <w:bookmarkEnd w:id="12"/>
+    </w:p>
+    <w:p>
+      <w:pPr>
+        <w:pStyle w:val="Ttulo2"/>
+      </w:pPr>
+      <w:bookmarkStart w:id="13" w:name="_Toc228797138"/>
+      <w:r>
+        <w:t>5.1 Contexto tecnológico actual</w:t>
+      </w:r>
       <w:bookmarkEnd w:id="13"/>
-    </w:p>
-    <w:p>
-      <w:pPr>
-        <w:pStyle w:val="Ttulo2"/>
-      </w:pPr>
-      <w:bookmarkStart w:id="14" w:name="_Toc228797138"/>
-      <w:r>
-        <w:t>5.1 Contexto tecnológico actual</w:t>
-      </w:r>
-      <w:bookmarkEnd w:id="14"/>
     </w:p>
     <w:p>
       <w:pPr>
@@ -11269,11 +11248,11 @@
       <w:pPr>
         <w:pStyle w:val="Ttulo2"/>
       </w:pPr>
-      <w:bookmarkStart w:id="15" w:name="_Toc228797139"/>
+      <w:bookmarkStart w:id="14" w:name="_Toc228797139"/>
       <w:r>
         <w:t>5.2 Sistemas existentes y comparativa</w:t>
       </w:r>
-      <w:bookmarkEnd w:id="15"/>
+      <w:bookmarkEnd w:id="14"/>
     </w:p>
     <w:p>
       <w:pPr>
@@ -11424,11 +11403,11 @@
       <w:pPr>
         <w:pStyle w:val="Ttulo2"/>
       </w:pPr>
-      <w:bookmarkStart w:id="16" w:name="_Toc228797140"/>
+      <w:bookmarkStart w:id="15" w:name="_Toc228797140"/>
       <w:r>
         <w:t>5.3 Enfoques tecnológicos actuales</w:t>
       </w:r>
-      <w:bookmarkEnd w:id="16"/>
+      <w:bookmarkEnd w:id="15"/>
     </w:p>
     <w:p>
       <w:pPr>
@@ -11515,12 +11494,12 @@
       <w:pPr>
         <w:pStyle w:val="Ttulo2"/>
       </w:pPr>
-      <w:bookmarkStart w:id="17" w:name="_Toc228797141"/>
+      <w:bookmarkStart w:id="16" w:name="_Toc228797141"/>
       <w:r>
         <w:lastRenderedPageBreak/>
         <w:t>5.4 Modelado de datos y normalización</w:t>
       </w:r>
-      <w:bookmarkEnd w:id="17"/>
+      <w:bookmarkEnd w:id="16"/>
     </w:p>
     <w:p>
       <w:pPr>
@@ -11605,11 +11584,11 @@
       <w:pPr>
         <w:pStyle w:val="Ttulo2"/>
       </w:pPr>
-      <w:bookmarkStart w:id="18" w:name="_Toc228797142"/>
+      <w:bookmarkStart w:id="17" w:name="_Toc228797142"/>
       <w:r>
         <w:t>5.5 Seguridad y control de acceso en aplicaciones web</w:t>
       </w:r>
-      <w:bookmarkEnd w:id="18"/>
+      <w:bookmarkEnd w:id="17"/>
     </w:p>
     <w:p>
       <w:pPr>
@@ -11669,11 +11648,11 @@
       <w:pPr>
         <w:pStyle w:val="Ttulo2"/>
       </w:pPr>
-      <w:bookmarkStart w:id="19" w:name="_Toc228797143"/>
+      <w:bookmarkStart w:id="18" w:name="_Toc228797143"/>
       <w:r>
         <w:t>5.6 Fundamentación del aporte del proyecto</w:t>
       </w:r>
-      <w:bookmarkEnd w:id="19"/>
+      <w:bookmarkEnd w:id="18"/>
     </w:p>
     <w:p>
       <w:pPr>
@@ -11780,11 +11759,11 @@
       <w:pPr>
         <w:pStyle w:val="Ttulo2"/>
       </w:pPr>
-      <w:bookmarkStart w:id="20" w:name="_Toc228797144"/>
+      <w:bookmarkStart w:id="19" w:name="_Toc228797144"/>
       <w:r>
         <w:t>5.7 Conclusión del Estado del Arte</w:t>
       </w:r>
-      <w:bookmarkEnd w:id="20"/>
+      <w:bookmarkEnd w:id="19"/>
     </w:p>
     <w:p>
       <w:pPr>
@@ -11883,7 +11862,7 @@
           <w:lang w:eastAsia="es-AR"/>
         </w:rPr>
       </w:pPr>
-      <w:bookmarkStart w:id="21" w:name="_Toc228797145"/>
+      <w:bookmarkStart w:id="20" w:name="_Toc228797145"/>
       <w:r>
         <w:rPr>
           <w:rFonts w:eastAsia="Times New Roman"/>
@@ -11891,7 +11870,7 @@
         </w:rPr>
         <w:t>6. DESCRIPCIÓN DEL PROYECTO</w:t>
       </w:r>
-      <w:bookmarkEnd w:id="21"/>
+      <w:bookmarkEnd w:id="20"/>
     </w:p>
     <w:p>
       <w:pPr>
@@ -11901,7 +11880,7 @@
           <w:lang w:eastAsia="es-AR"/>
         </w:rPr>
       </w:pPr>
-      <w:bookmarkStart w:id="22" w:name="_Toc228797146"/>
+      <w:bookmarkStart w:id="21" w:name="_Toc228797146"/>
       <w:r>
         <w:rPr>
           <w:rFonts w:eastAsia="Times New Roman"/>
@@ -11909,7 +11888,7 @@
         </w:rPr>
         <w:t>6.1 Problemática Detectada</w:t>
       </w:r>
-      <w:bookmarkEnd w:id="22"/>
+      <w:bookmarkEnd w:id="21"/>
     </w:p>
     <w:p>
       <w:pPr>
@@ -12037,7 +12016,7 @@
           <w:lang w:eastAsia="es-AR"/>
         </w:rPr>
       </w:pPr>
-      <w:bookmarkStart w:id="23" w:name="_Toc228797147"/>
+      <w:bookmarkStart w:id="22" w:name="_Toc228797147"/>
       <w:r>
         <w:rPr>
           <w:rFonts w:eastAsia="Times New Roman"/>
@@ -12045,7 +12024,7 @@
         </w:rPr>
         <w:t>6.2 Solución Propuesta</w:t>
       </w:r>
-      <w:bookmarkEnd w:id="23"/>
+      <w:bookmarkEnd w:id="22"/>
     </w:p>
     <w:p>
       <w:pPr>
@@ -12305,7 +12284,7 @@
           <w:lang w:eastAsia="es-AR"/>
         </w:rPr>
       </w:pPr>
-      <w:bookmarkStart w:id="24" w:name="_Toc228797148"/>
+      <w:bookmarkStart w:id="23" w:name="_Toc228797148"/>
       <w:r>
         <w:rPr>
           <w:rFonts w:eastAsia="Times New Roman"/>
@@ -12313,7 +12292,7 @@
         </w:rPr>
         <w:t>6.3 Alcance del Proyecto</w:t>
       </w:r>
-      <w:bookmarkEnd w:id="24"/>
+      <w:bookmarkEnd w:id="23"/>
     </w:p>
     <w:p>
       <w:pPr>
@@ -12548,7 +12527,7 @@
           <w:lang w:eastAsia="es-AR"/>
         </w:rPr>
       </w:pPr>
-      <w:bookmarkStart w:id="25" w:name="_Toc228797149"/>
+      <w:bookmarkStart w:id="24" w:name="_Toc228797149"/>
       <w:r>
         <w:rPr>
           <w:rFonts w:eastAsia="Times New Roman"/>
@@ -12556,7 +12535,7 @@
         </w:rPr>
         <w:t>6.4 Análisis del Mercado</w:t>
       </w:r>
-      <w:bookmarkEnd w:id="25"/>
+      <w:bookmarkEnd w:id="24"/>
     </w:p>
     <w:p>
       <w:pPr>
@@ -12661,7 +12640,7 @@
           <w:lang w:eastAsia="es-AR"/>
         </w:rPr>
       </w:pPr>
-      <w:bookmarkStart w:id="26" w:name="_Toc228797150"/>
+      <w:bookmarkStart w:id="25" w:name="_Toc228797150"/>
       <w:r>
         <w:rPr>
           <w:rFonts w:eastAsia="Times New Roman"/>
@@ -12669,7 +12648,7 @@
         </w:rPr>
         <w:t>6.5 Criterios de Éxito</w:t>
       </w:r>
-      <w:bookmarkEnd w:id="26"/>
+      <w:bookmarkEnd w:id="25"/>
       <w:r>
         <w:rPr>
           <w:rFonts w:eastAsia="Times New Roman"/>
@@ -12799,7 +12778,7 @@
           <w:lang w:eastAsia="es-AR"/>
         </w:rPr>
       </w:pPr>
-      <w:bookmarkStart w:id="27" w:name="_Toc228797151"/>
+      <w:bookmarkStart w:id="26" w:name="_Toc228797151"/>
       <w:r>
         <w:rPr>
           <w:rFonts w:eastAsia="Times New Roman"/>
@@ -12807,7 +12786,7 @@
         </w:rPr>
         <w:t>6.6 DIAGRAMA ENTIDAD-RELACIÓN</w:t>
       </w:r>
-      <w:bookmarkEnd w:id="27"/>
+      <w:bookmarkEnd w:id="26"/>
     </w:p>
     <w:p>
       <w:pPr>
@@ -12880,7 +12859,7 @@
           <w:lang w:eastAsia="es-AR"/>
         </w:rPr>
       </w:pPr>
-      <w:bookmarkStart w:id="28" w:name="_Toc228797152"/>
+      <w:bookmarkStart w:id="27" w:name="_Toc228797152"/>
       <w:r>
         <w:rPr>
           <w:rFonts w:ascii="Times New Roman" w:eastAsia="Times New Roman" w:hAnsi="Times New Roman" w:cs="Times New Roman"/>
@@ -12893,7 +12872,7 @@
         </w:rPr>
         <w:lastRenderedPageBreak/>
         <w:drawing>
-          <wp:anchor distT="0" distB="0" distL="114300" distR="114300" simplePos="0" relativeHeight="251668480" behindDoc="0" locked="0" layoutInCell="1" allowOverlap="1" wp14:anchorId="08260F36" wp14:editId="37224549">
+          <wp:anchor distT="0" distB="0" distL="114300" distR="114300" simplePos="0" relativeHeight="251668480" behindDoc="0" locked="0" layoutInCell="1" allowOverlap="1" wp14:anchorId="0842A435" wp14:editId="7FA2302F">
             <wp:simplePos x="0" y="0"/>
             <wp:positionH relativeFrom="column">
               <wp:posOffset>-1951355</wp:posOffset>
@@ -12948,28 +12927,28 @@
           </wp:anchor>
         </w:drawing>
       </w:r>
-      <w:bookmarkEnd w:id="28"/>
+      <w:bookmarkEnd w:id="27"/>
     </w:p>
     <w:p>
       <w:pPr>
         <w:pStyle w:val="Ttulo2"/>
       </w:pPr>
-      <w:bookmarkStart w:id="29" w:name="_Toc228797153"/>
+      <w:bookmarkStart w:id="28" w:name="_Toc228797153"/>
       <w:r>
         <w:lastRenderedPageBreak/>
         <w:t>6.7 Reglas de Negocio</w:t>
       </w:r>
+      <w:bookmarkEnd w:id="28"/>
+    </w:p>
+    <w:p>
+      <w:pPr>
+        <w:pStyle w:val="Ttulo3"/>
+      </w:pPr>
+      <w:bookmarkStart w:id="29" w:name="_Toc228797154"/>
+      <w:r>
+        <w:t>6.7.1 Gestión de Pacientes e Historias Clínicas</w:t>
+      </w:r>
       <w:bookmarkEnd w:id="29"/>
-    </w:p>
-    <w:p>
-      <w:pPr>
-        <w:pStyle w:val="Ttulo3"/>
-      </w:pPr>
-      <w:bookmarkStart w:id="30" w:name="_Toc228797154"/>
-      <w:r>
-        <w:t>6.7.1 Gestión de Pacientes e Historias Clínicas</w:t>
-      </w:r>
-      <w:bookmarkEnd w:id="30"/>
     </w:p>
     <w:p>
       <w:pPr>
@@ -13032,11 +13011,11 @@
       <w:pPr>
         <w:pStyle w:val="Ttulo3"/>
       </w:pPr>
-      <w:bookmarkStart w:id="31" w:name="_Toc228797155"/>
+      <w:bookmarkStart w:id="30" w:name="_Toc228797155"/>
       <w:r>
         <w:t>6.7.2 Turnos y Peluquería</w:t>
       </w:r>
-      <w:bookmarkEnd w:id="31"/>
+      <w:bookmarkEnd w:id="30"/>
     </w:p>
     <w:p>
       <w:pPr>
@@ -13099,11 +13078,11 @@
       <w:pPr>
         <w:pStyle w:val="Ttulo3"/>
       </w:pPr>
-      <w:bookmarkStart w:id="32" w:name="_Toc228797156"/>
+      <w:bookmarkStart w:id="31" w:name="_Toc228797156"/>
       <w:r>
         <w:t>6.7.3 Productos y Stock</w:t>
       </w:r>
-      <w:bookmarkEnd w:id="32"/>
+      <w:bookmarkEnd w:id="31"/>
     </w:p>
     <w:p>
       <w:pPr>
@@ -13166,11 +13145,11 @@
       <w:pPr>
         <w:pStyle w:val="Ttulo3"/>
       </w:pPr>
-      <w:bookmarkStart w:id="33" w:name="_Toc228797157"/>
+      <w:bookmarkStart w:id="32" w:name="_Toc228797157"/>
       <w:r>
         <w:t>6.7.4 Ventas y Cobros</w:t>
       </w:r>
-      <w:bookmarkEnd w:id="33"/>
+      <w:bookmarkEnd w:id="32"/>
     </w:p>
     <w:p>
       <w:pPr>
@@ -13233,11 +13212,11 @@
       <w:pPr>
         <w:pStyle w:val="Ttulo3"/>
       </w:pPr>
-      <w:bookmarkStart w:id="34" w:name="_Toc228797158"/>
+      <w:bookmarkStart w:id="33" w:name="_Toc228797158"/>
       <w:r>
         <w:t>6.7.5 Seguridad y Roles</w:t>
       </w:r>
-      <w:bookmarkEnd w:id="34"/>
+      <w:bookmarkEnd w:id="33"/>
     </w:p>
     <w:p>
       <w:pPr>
@@ -13313,7 +13292,7 @@
           <w:lang w:val="es-ES"/>
         </w:rPr>
       </w:pPr>
-      <w:bookmarkStart w:id="35" w:name="_Toc228797159"/>
+      <w:bookmarkStart w:id="34" w:name="_Toc228797159"/>
       <w:r>
         <w:rPr>
           <w:lang w:val="es-ES"/>
@@ -13332,7 +13311,7 @@
         </w:rPr>
         <w:t xml:space="preserve"> Historias de Usuario</w:t>
       </w:r>
-      <w:bookmarkEnd w:id="35"/>
+      <w:bookmarkEnd w:id="34"/>
     </w:p>
     <w:p>
       <w:pPr>
@@ -13379,8 +13358,8 @@
               <w:outlineLvl w:val="2"/>
               <w:cnfStyle w:val="100000000000" w:firstRow="1" w:lastRow="0" w:firstColumn="0" w:lastColumn="0" w:oddVBand="0" w:evenVBand="0" w:oddHBand="0" w:evenHBand="0" w:firstRowFirstColumn="0" w:firstRowLastColumn="0" w:lastRowFirstColumn="0" w:lastRowLastColumn="0"/>
             </w:pPr>
-            <w:bookmarkStart w:id="36" w:name="_Toc215589492"/>
-            <w:bookmarkStart w:id="37" w:name="_Toc228797160"/>
+            <w:bookmarkStart w:id="35" w:name="_Toc215589492"/>
+            <w:bookmarkStart w:id="36" w:name="_Toc228797160"/>
             <w:r>
               <w:t xml:space="preserve">6.8.1 </w:t>
             </w:r>
@@ -13390,8 +13369,8 @@
             <w:r>
               <w:t xml:space="preserve"> de Roles</w:t>
             </w:r>
+            <w:bookmarkEnd w:id="35"/>
             <w:bookmarkEnd w:id="36"/>
-            <w:bookmarkEnd w:id="37"/>
           </w:p>
         </w:tc>
       </w:tr>
@@ -13689,8 +13668,8 @@
               <w:outlineLvl w:val="2"/>
               <w:cnfStyle w:val="100000000000" w:firstRow="1" w:lastRow="0" w:firstColumn="0" w:lastColumn="0" w:oddVBand="0" w:evenVBand="0" w:oddHBand="0" w:evenHBand="0" w:firstRowFirstColumn="0" w:firstRowLastColumn="0" w:lastRowFirstColumn="0" w:lastRowLastColumn="0"/>
             </w:pPr>
-            <w:bookmarkStart w:id="38" w:name="_Toc215589493"/>
-            <w:bookmarkStart w:id="39" w:name="_Toc228797161"/>
+            <w:bookmarkStart w:id="37" w:name="_Toc215589493"/>
+            <w:bookmarkStart w:id="38" w:name="_Toc228797161"/>
             <w:r>
               <w:t xml:space="preserve">6.8.2 </w:t>
             </w:r>
@@ -13700,8 +13679,8 @@
             <w:r>
               <w:t xml:space="preserve"> de Veterinarios</w:t>
             </w:r>
+            <w:bookmarkEnd w:id="37"/>
             <w:bookmarkEnd w:id="38"/>
-            <w:bookmarkEnd w:id="39"/>
           </w:p>
         </w:tc>
       </w:tr>
@@ -14044,8 +14023,8 @@
               <w:outlineLvl w:val="2"/>
               <w:cnfStyle w:val="100000000000" w:firstRow="1" w:lastRow="0" w:firstColumn="0" w:lastColumn="0" w:oddVBand="0" w:evenVBand="0" w:oddHBand="0" w:evenHBand="0" w:firstRowFirstColumn="0" w:firstRowLastColumn="0" w:lastRowFirstColumn="0" w:lastRowLastColumn="0"/>
             </w:pPr>
-            <w:bookmarkStart w:id="40" w:name="_Toc215589494"/>
-            <w:bookmarkStart w:id="41" w:name="_Toc228797162"/>
+            <w:bookmarkStart w:id="39" w:name="_Toc215589494"/>
+            <w:bookmarkStart w:id="40" w:name="_Toc228797162"/>
             <w:r>
               <w:t xml:space="preserve">6.8.3 </w:t>
             </w:r>
@@ -14055,8 +14034,8 @@
             <w:r>
               <w:t xml:space="preserve"> de empleados</w:t>
             </w:r>
+            <w:bookmarkEnd w:id="39"/>
             <w:bookmarkEnd w:id="40"/>
-            <w:bookmarkEnd w:id="41"/>
           </w:p>
         </w:tc>
       </w:tr>
@@ -14405,16 +14384,16 @@
               <w:outlineLvl w:val="2"/>
               <w:cnfStyle w:val="100000000000" w:firstRow="1" w:lastRow="0" w:firstColumn="0" w:lastColumn="0" w:oddVBand="0" w:evenVBand="0" w:oddHBand="0" w:evenHBand="0" w:firstRowFirstColumn="0" w:firstRowLastColumn="0" w:lastRowFirstColumn="0" w:lastRowLastColumn="0"/>
             </w:pPr>
-            <w:bookmarkStart w:id="42" w:name="_Toc215589495"/>
-            <w:bookmarkStart w:id="43" w:name="_Toc228797163"/>
+            <w:bookmarkStart w:id="41" w:name="_Toc215589495"/>
+            <w:bookmarkStart w:id="42" w:name="_Toc228797163"/>
             <w:r>
               <w:t xml:space="preserve">6.8.4 </w:t>
             </w:r>
             <w:r>
               <w:t>Gestión de mascotas</w:t>
             </w:r>
+            <w:bookmarkEnd w:id="41"/>
             <w:bookmarkEnd w:id="42"/>
-            <w:bookmarkEnd w:id="43"/>
           </w:p>
         </w:tc>
       </w:tr>
@@ -14824,8 +14803,8 @@
               <w:outlineLvl w:val="2"/>
               <w:cnfStyle w:val="100000000000" w:firstRow="1" w:lastRow="0" w:firstColumn="0" w:lastColumn="0" w:oddVBand="0" w:evenVBand="0" w:oddHBand="0" w:evenHBand="0" w:firstRowFirstColumn="0" w:firstRowLastColumn="0" w:lastRowFirstColumn="0" w:lastRowLastColumn="0"/>
             </w:pPr>
-            <w:bookmarkStart w:id="44" w:name="_Toc215589496"/>
-            <w:bookmarkStart w:id="45" w:name="_Toc228797164"/>
+            <w:bookmarkStart w:id="43" w:name="_Toc215589496"/>
+            <w:bookmarkStart w:id="44" w:name="_Toc228797164"/>
             <w:r>
               <w:t xml:space="preserve">6.8.5 </w:t>
             </w:r>
@@ -14835,8 +14814,8 @@
             <w:r>
               <w:t xml:space="preserve"> de turnos</w:t>
             </w:r>
+            <w:bookmarkEnd w:id="43"/>
             <w:bookmarkEnd w:id="44"/>
-            <w:bookmarkEnd w:id="45"/>
           </w:p>
         </w:tc>
       </w:tr>
@@ -15309,8 +15288,8 @@
               <w:outlineLvl w:val="2"/>
               <w:cnfStyle w:val="100000000000" w:firstRow="1" w:lastRow="0" w:firstColumn="0" w:lastColumn="0" w:oddVBand="0" w:evenVBand="0" w:oddHBand="0" w:evenHBand="0" w:firstRowFirstColumn="0" w:firstRowLastColumn="0" w:lastRowFirstColumn="0" w:lastRowLastColumn="0"/>
             </w:pPr>
-            <w:bookmarkStart w:id="46" w:name="_Toc215589497"/>
-            <w:bookmarkStart w:id="47" w:name="_Toc228797165"/>
+            <w:bookmarkStart w:id="45" w:name="_Toc215589497"/>
+            <w:bookmarkStart w:id="46" w:name="_Toc228797165"/>
             <w:r>
               <w:t xml:space="preserve">6.8.6 </w:t>
             </w:r>
@@ -15320,8 +15299,8 @@
             <w:r>
               <w:t xml:space="preserve"> de clientes</w:t>
             </w:r>
+            <w:bookmarkEnd w:id="45"/>
             <w:bookmarkEnd w:id="46"/>
-            <w:bookmarkEnd w:id="47"/>
           </w:p>
         </w:tc>
       </w:tr>
@@ -15742,8 +15721,8 @@
               <w:outlineLvl w:val="2"/>
               <w:cnfStyle w:val="100000000000" w:firstRow="1" w:lastRow="0" w:firstColumn="0" w:lastColumn="0" w:oddVBand="0" w:evenVBand="0" w:oddHBand="0" w:evenHBand="0" w:firstRowFirstColumn="0" w:firstRowLastColumn="0" w:lastRowFirstColumn="0" w:lastRowLastColumn="0"/>
             </w:pPr>
-            <w:bookmarkStart w:id="48" w:name="_Toc215589498"/>
-            <w:bookmarkStart w:id="49" w:name="_Toc228797166"/>
+            <w:bookmarkStart w:id="47" w:name="_Toc215589498"/>
+            <w:bookmarkStart w:id="48" w:name="_Toc228797166"/>
             <w:r>
               <w:t xml:space="preserve">6.8.7 </w:t>
             </w:r>
@@ -15762,8 +15741,8 @@
             <w:r>
               <w:t xml:space="preserve"> razas</w:t>
             </w:r>
+            <w:bookmarkEnd w:id="47"/>
             <w:bookmarkEnd w:id="48"/>
-            <w:bookmarkEnd w:id="49"/>
           </w:p>
         </w:tc>
       </w:tr>
@@ -16173,16 +16152,16 @@
               <w:outlineLvl w:val="2"/>
               <w:cnfStyle w:val="100000000000" w:firstRow="1" w:lastRow="0" w:firstColumn="0" w:lastColumn="0" w:oddVBand="0" w:evenVBand="0" w:oddHBand="0" w:evenHBand="0" w:firstRowFirstColumn="0" w:firstRowLastColumn="0" w:lastRowFirstColumn="0" w:lastRowLastColumn="0"/>
             </w:pPr>
-            <w:bookmarkStart w:id="50" w:name="_Toc215589499"/>
-            <w:bookmarkStart w:id="51" w:name="_Toc228797167"/>
+            <w:bookmarkStart w:id="49" w:name="_Toc215589499"/>
+            <w:bookmarkStart w:id="50" w:name="_Toc228797167"/>
             <w:r>
               <w:t xml:space="preserve">6.8.8 </w:t>
             </w:r>
             <w:r>
               <w:t>Gestión de especies</w:t>
             </w:r>
+            <w:bookmarkEnd w:id="49"/>
             <w:bookmarkEnd w:id="50"/>
-            <w:bookmarkEnd w:id="51"/>
           </w:p>
         </w:tc>
       </w:tr>
@@ -16535,8 +16514,8 @@
               <w:outlineLvl w:val="2"/>
               <w:cnfStyle w:val="100000000000" w:firstRow="1" w:lastRow="0" w:firstColumn="0" w:lastColumn="0" w:oddVBand="0" w:evenVBand="0" w:oddHBand="0" w:evenHBand="0" w:firstRowFirstColumn="0" w:firstRowLastColumn="0" w:lastRowFirstColumn="0" w:lastRowLastColumn="0"/>
             </w:pPr>
-            <w:bookmarkStart w:id="52" w:name="_Toc215589500"/>
-            <w:bookmarkStart w:id="53" w:name="_Toc228797168"/>
+            <w:bookmarkStart w:id="51" w:name="_Toc215589500"/>
+            <w:bookmarkStart w:id="52" w:name="_Toc228797168"/>
             <w:r>
               <w:t xml:space="preserve">6.8.9 </w:t>
             </w:r>
@@ -16546,11 +16525,11 @@
             <w:r>
               <w:t xml:space="preserve"> de historias </w:t>
             </w:r>
+            <w:bookmarkEnd w:id="51"/>
+            <w:r>
+              <w:t>clínica</w:t>
+            </w:r>
             <w:bookmarkEnd w:id="52"/>
-            <w:r>
-              <w:t>clínica</w:t>
-            </w:r>
-            <w:bookmarkEnd w:id="53"/>
           </w:p>
         </w:tc>
       </w:tr>
@@ -16983,8 +16962,8 @@
               <w:outlineLvl w:val="2"/>
               <w:cnfStyle w:val="100000000000" w:firstRow="1" w:lastRow="0" w:firstColumn="0" w:lastColumn="0" w:oddVBand="0" w:evenVBand="0" w:oddHBand="0" w:evenHBand="0" w:firstRowFirstColumn="0" w:firstRowLastColumn="0" w:lastRowFirstColumn="0" w:lastRowLastColumn="0"/>
             </w:pPr>
-            <w:bookmarkStart w:id="54" w:name="_Toc215589501"/>
-            <w:bookmarkStart w:id="55" w:name="_Toc228797169"/>
+            <w:bookmarkStart w:id="53" w:name="_Toc215589501"/>
+            <w:bookmarkStart w:id="54" w:name="_Toc228797169"/>
             <w:r>
               <w:t xml:space="preserve">6.8.10 </w:t>
             </w:r>
@@ -16994,11 +16973,11 @@
             <w:r>
               <w:t xml:space="preserve"> de detalle de historias </w:t>
             </w:r>
+            <w:bookmarkEnd w:id="53"/>
+            <w:r>
+              <w:t>clínicas</w:t>
+            </w:r>
             <w:bookmarkEnd w:id="54"/>
-            <w:r>
-              <w:t>clínicas</w:t>
-            </w:r>
-            <w:bookmarkEnd w:id="55"/>
           </w:p>
         </w:tc>
       </w:tr>
@@ -17399,8 +17378,8 @@
               <w:outlineLvl w:val="2"/>
               <w:cnfStyle w:val="100000000000" w:firstRow="1" w:lastRow="0" w:firstColumn="0" w:lastColumn="0" w:oddVBand="0" w:evenVBand="0" w:oddHBand="0" w:evenHBand="0" w:firstRowFirstColumn="0" w:firstRowLastColumn="0" w:lastRowFirstColumn="0" w:lastRowLastColumn="0"/>
             </w:pPr>
-            <w:bookmarkStart w:id="56" w:name="_Toc215589502"/>
-            <w:bookmarkStart w:id="57" w:name="_Toc228797170"/>
+            <w:bookmarkStart w:id="55" w:name="_Toc215589502"/>
+            <w:bookmarkStart w:id="56" w:name="_Toc228797170"/>
             <w:r>
               <w:t xml:space="preserve">6.8.11 </w:t>
             </w:r>
@@ -17410,8 +17389,8 @@
             <w:r>
               <w:t xml:space="preserve"> de stock</w:t>
             </w:r>
+            <w:bookmarkEnd w:id="55"/>
             <w:bookmarkEnd w:id="56"/>
-            <w:bookmarkEnd w:id="57"/>
           </w:p>
         </w:tc>
       </w:tr>
@@ -17966,8 +17945,8 @@
               <w:outlineLvl w:val="2"/>
               <w:cnfStyle w:val="100000000000" w:firstRow="1" w:lastRow="0" w:firstColumn="0" w:lastColumn="0" w:oddVBand="0" w:evenVBand="0" w:oddHBand="0" w:evenHBand="0" w:firstRowFirstColumn="0" w:firstRowLastColumn="0" w:lastRowFirstColumn="0" w:lastRowLastColumn="0"/>
             </w:pPr>
-            <w:bookmarkStart w:id="58" w:name="_Toc215589505"/>
-            <w:bookmarkStart w:id="59" w:name="_Toc228797171"/>
+            <w:bookmarkStart w:id="57" w:name="_Toc215589505"/>
+            <w:bookmarkStart w:id="58" w:name="_Toc228797171"/>
             <w:r>
               <w:t>6.8.12</w:t>
             </w:r>
@@ -17977,11 +17956,11 @@
             <w:r>
               <w:t xml:space="preserve">Gestión de </w:t>
             </w:r>
+            <w:bookmarkEnd w:id="57"/>
+            <w:r>
+              <w:t>categorías</w:t>
+            </w:r>
             <w:bookmarkEnd w:id="58"/>
-            <w:r>
-              <w:t>categorías</w:t>
-            </w:r>
-            <w:bookmarkEnd w:id="59"/>
           </w:p>
         </w:tc>
       </w:tr>
@@ -18233,8 +18212,8 @@
               <w:outlineLvl w:val="2"/>
               <w:cnfStyle w:val="100000000000" w:firstRow="1" w:lastRow="0" w:firstColumn="0" w:lastColumn="0" w:oddVBand="0" w:evenVBand="0" w:oddHBand="0" w:evenHBand="0" w:firstRowFirstColumn="0" w:firstRowLastColumn="0" w:lastRowFirstColumn="0" w:lastRowLastColumn="0"/>
             </w:pPr>
-            <w:bookmarkStart w:id="60" w:name="_Toc215589506"/>
-            <w:bookmarkStart w:id="61" w:name="_Toc228797172"/>
+            <w:bookmarkStart w:id="59" w:name="_Toc215589506"/>
+            <w:bookmarkStart w:id="60" w:name="_Toc228797172"/>
             <w:r>
               <w:t>6.8.13</w:t>
             </w:r>
@@ -18247,8 +18226,8 @@
             <w:r>
               <w:t xml:space="preserve"> de productos</w:t>
             </w:r>
+            <w:bookmarkEnd w:id="59"/>
             <w:bookmarkEnd w:id="60"/>
-            <w:bookmarkEnd w:id="61"/>
           </w:p>
         </w:tc>
       </w:tr>
@@ -18499,8 +18478,8 @@
               <w:outlineLvl w:val="2"/>
               <w:cnfStyle w:val="100000000000" w:firstRow="1" w:lastRow="0" w:firstColumn="0" w:lastColumn="0" w:oddVBand="0" w:evenVBand="0" w:oddHBand="0" w:evenHBand="0" w:firstRowFirstColumn="0" w:firstRowLastColumn="0" w:lastRowFirstColumn="0" w:lastRowLastColumn="0"/>
             </w:pPr>
-            <w:bookmarkStart w:id="62" w:name="_Toc215589513"/>
-            <w:bookmarkStart w:id="63" w:name="_Toc228797173"/>
+            <w:bookmarkStart w:id="61" w:name="_Toc215589513"/>
+            <w:bookmarkStart w:id="62" w:name="_Toc228797173"/>
             <w:r>
               <w:t>6.8.14</w:t>
             </w:r>
@@ -18513,8 +18492,8 @@
             <w:r>
               <w:t xml:space="preserve"> de ventas</w:t>
             </w:r>
+            <w:bookmarkEnd w:id="61"/>
             <w:bookmarkEnd w:id="62"/>
-            <w:bookmarkEnd w:id="63"/>
             <w:r>
               <w:tab/>
             </w:r>
@@ -18743,8 +18722,8 @@
               <w:outlineLvl w:val="2"/>
               <w:cnfStyle w:val="100000000000" w:firstRow="1" w:lastRow="0" w:firstColumn="0" w:lastColumn="0" w:oddVBand="0" w:evenVBand="0" w:oddHBand="0" w:evenHBand="0" w:firstRowFirstColumn="0" w:firstRowLastColumn="0" w:lastRowFirstColumn="0" w:lastRowLastColumn="0"/>
             </w:pPr>
-            <w:bookmarkStart w:id="64" w:name="_Toc215589515"/>
-            <w:bookmarkStart w:id="65" w:name="_Toc228797174"/>
+            <w:bookmarkStart w:id="63" w:name="_Toc215589515"/>
+            <w:bookmarkStart w:id="64" w:name="_Toc228797174"/>
             <w:r>
               <w:t>6.8.15</w:t>
             </w:r>
@@ -18757,8 +18736,8 @@
             <w:r>
               <w:t xml:space="preserve"> de detalles de ventas</w:t>
             </w:r>
+            <w:bookmarkEnd w:id="63"/>
             <w:bookmarkEnd w:id="64"/>
-            <w:bookmarkEnd w:id="65"/>
           </w:p>
         </w:tc>
       </w:tr>
@@ -19029,8 +19008,8 @@
               <w:outlineLvl w:val="2"/>
               <w:cnfStyle w:val="100000000000" w:firstRow="1" w:lastRow="0" w:firstColumn="0" w:lastColumn="0" w:oddVBand="0" w:evenVBand="0" w:oddHBand="0" w:evenHBand="0" w:firstRowFirstColumn="0" w:firstRowLastColumn="0" w:lastRowFirstColumn="0" w:lastRowLastColumn="0"/>
             </w:pPr>
-            <w:bookmarkStart w:id="66" w:name="_Toc215589516"/>
-            <w:bookmarkStart w:id="67" w:name="_Toc228797175"/>
+            <w:bookmarkStart w:id="65" w:name="_Toc215589516"/>
+            <w:bookmarkStart w:id="66" w:name="_Toc228797175"/>
             <w:r>
               <w:t>6.8.16</w:t>
             </w:r>
@@ -19043,8 +19022,8 @@
             <w:r>
               <w:t xml:space="preserve"> de detalles de ventas (recepcionista)</w:t>
             </w:r>
+            <w:bookmarkEnd w:id="65"/>
             <w:bookmarkEnd w:id="66"/>
-            <w:bookmarkEnd w:id="67"/>
           </w:p>
         </w:tc>
       </w:tr>
@@ -19332,7 +19311,7 @@
               <w:outlineLvl w:val="2"/>
               <w:cnfStyle w:val="100000000000" w:firstRow="1" w:lastRow="0" w:firstColumn="0" w:lastColumn="0" w:oddVBand="0" w:evenVBand="0" w:oddHBand="0" w:evenHBand="0" w:firstRowFirstColumn="0" w:firstRowLastColumn="0" w:lastRowFirstColumn="0" w:lastRowLastColumn="0"/>
             </w:pPr>
-            <w:bookmarkStart w:id="68" w:name="_Toc228797176"/>
+            <w:bookmarkStart w:id="67" w:name="_Toc228797176"/>
             <w:r>
               <w:t>6.8.17</w:t>
             </w:r>
@@ -19345,7 +19324,7 @@
             <w:r>
               <w:t>Informes</w:t>
             </w:r>
-            <w:bookmarkEnd w:id="68"/>
+            <w:bookmarkEnd w:id="67"/>
           </w:p>
         </w:tc>
       </w:tr>
@@ -19757,7 +19736,7 @@
               <w:outlineLvl w:val="2"/>
               <w:cnfStyle w:val="100000000000" w:firstRow="1" w:lastRow="0" w:firstColumn="0" w:lastColumn="0" w:oddVBand="0" w:evenVBand="0" w:oddHBand="0" w:evenHBand="0" w:firstRowFirstColumn="0" w:firstRowLastColumn="0" w:lastRowFirstColumn="0" w:lastRowLastColumn="0"/>
             </w:pPr>
-            <w:bookmarkStart w:id="69" w:name="_Toc228797177"/>
+            <w:bookmarkStart w:id="68" w:name="_Toc228797177"/>
             <w:r>
               <w:t>6.8.18</w:t>
             </w:r>
@@ -19770,7 +19749,7 @@
             <w:r>
               <w:t xml:space="preserve"> Auditorias</w:t>
             </w:r>
-            <w:bookmarkEnd w:id="69"/>
+            <w:bookmarkEnd w:id="68"/>
           </w:p>
         </w:tc>
       </w:tr>
@@ -20112,7 +20091,7 @@
           <w:lang w:val="es-ES"/>
         </w:rPr>
       </w:pPr>
-      <w:bookmarkStart w:id="70" w:name="_Toc228797178"/>
+      <w:bookmarkStart w:id="69" w:name="_Toc228797178"/>
       <w:r>
         <w:rPr>
           <w:lang w:val="es-ES"/>
@@ -20131,25 +20110,25 @@
         </w:rPr>
         <w:t xml:space="preserve"> Requerimientos Funcionales</w:t>
       </w:r>
+      <w:bookmarkEnd w:id="69"/>
+    </w:p>
+    <w:p>
+      <w:pPr>
+        <w:pStyle w:val="Ttulo3"/>
+      </w:pPr>
+      <w:bookmarkStart w:id="70" w:name="_Toc215589461"/>
+      <w:bookmarkStart w:id="71" w:name="_Toc228797179"/>
+      <w:r>
+        <w:t>6.9.1</w:t>
+      </w:r>
+      <w:r>
+        <w:t xml:space="preserve"> Gestión de </w:t>
+      </w:r>
+      <w:r>
+        <w:t>Roles</w:t>
+      </w:r>
       <w:bookmarkEnd w:id="70"/>
-    </w:p>
-    <w:p>
-      <w:pPr>
-        <w:pStyle w:val="Ttulo3"/>
-      </w:pPr>
-      <w:bookmarkStart w:id="71" w:name="_Toc215589461"/>
-      <w:bookmarkStart w:id="72" w:name="_Toc228797179"/>
-      <w:r>
-        <w:t>6.9.1</w:t>
-      </w:r>
-      <w:r>
-        <w:t xml:space="preserve"> Gestión de </w:t>
-      </w:r>
-      <w:r>
-        <w:t>Roles</w:t>
-      </w:r>
       <w:bookmarkEnd w:id="71"/>
-      <w:bookmarkEnd w:id="72"/>
     </w:p>
     <w:tbl>
       <w:tblPr>
@@ -20388,8 +20367,8 @@
       <w:pPr>
         <w:pStyle w:val="Ttulo3"/>
       </w:pPr>
-      <w:bookmarkStart w:id="73" w:name="_Toc215589462"/>
-      <w:bookmarkStart w:id="74" w:name="_Toc228797180"/>
+      <w:bookmarkStart w:id="72" w:name="_Toc215589462"/>
+      <w:bookmarkStart w:id="73" w:name="_Toc228797180"/>
       <w:r>
         <w:rPr>
           <w:lang w:val="es-ES"/>
@@ -20406,8 +20385,8 @@
       <w:r>
         <w:t xml:space="preserve"> Veterinario</w:t>
       </w:r>
+      <w:bookmarkEnd w:id="72"/>
       <w:bookmarkEnd w:id="73"/>
-      <w:bookmarkEnd w:id="74"/>
     </w:p>
     <w:tbl>
       <w:tblPr>
@@ -20646,8 +20625,8 @@
       <w:pPr>
         <w:pStyle w:val="Ttulo3"/>
       </w:pPr>
-      <w:bookmarkStart w:id="75" w:name="_Toc215589463"/>
-      <w:bookmarkStart w:id="76" w:name="_Toc228797181"/>
+      <w:bookmarkStart w:id="74" w:name="_Toc215589463"/>
+      <w:bookmarkStart w:id="75" w:name="_Toc228797181"/>
       <w:r>
         <w:rPr>
           <w:lang w:val="es-ES"/>
@@ -20663,8 +20642,8 @@
       <w:r>
         <w:t>Gestión de Empleados</w:t>
       </w:r>
+      <w:bookmarkEnd w:id="74"/>
       <w:bookmarkEnd w:id="75"/>
-      <w:bookmarkEnd w:id="76"/>
     </w:p>
     <w:tbl>
       <w:tblPr>
@@ -20903,8 +20882,8 @@
       <w:pPr>
         <w:pStyle w:val="Ttulo3"/>
       </w:pPr>
-      <w:bookmarkStart w:id="77" w:name="_Toc215589464"/>
-      <w:bookmarkStart w:id="78" w:name="_Toc228797182"/>
+      <w:bookmarkStart w:id="76" w:name="_Toc215589464"/>
+      <w:bookmarkStart w:id="77" w:name="_Toc228797182"/>
       <w:r>
         <w:rPr>
           <w:lang w:val="es-ES"/>
@@ -20920,8 +20899,8 @@
       <w:r>
         <w:t>Gestión de Mascotas</w:t>
       </w:r>
+      <w:bookmarkEnd w:id="76"/>
       <w:bookmarkEnd w:id="77"/>
-      <w:bookmarkEnd w:id="78"/>
     </w:p>
     <w:tbl>
       <w:tblPr>
@@ -21165,7 +21144,7 @@
           <w:lang w:val="es-ES" w:eastAsia="en-US"/>
         </w:rPr>
       </w:pPr>
-      <w:bookmarkStart w:id="79" w:name="_Toc215589465"/>
+      <w:bookmarkStart w:id="78" w:name="_Toc215589465"/>
     </w:p>
     <w:p>
       <w:pPr>
@@ -21174,7 +21153,7 @@
           <w:lang w:val="es-ES"/>
         </w:rPr>
       </w:pPr>
-      <w:bookmarkStart w:id="80" w:name="_Toc228797183"/>
+      <w:bookmarkStart w:id="79" w:name="_Toc228797183"/>
       <w:r>
         <w:rPr>
           <w:lang w:val="es-ES"/>
@@ -21187,8 +21166,8 @@
         </w:rPr>
         <w:t xml:space="preserve"> Gestión de Turnos</w:t>
       </w:r>
+      <w:bookmarkEnd w:id="78"/>
       <w:bookmarkEnd w:id="79"/>
-      <w:bookmarkEnd w:id="80"/>
     </w:p>
     <w:tbl>
       <w:tblPr>
@@ -21486,8 +21465,8 @@
       <w:pPr>
         <w:pStyle w:val="Ttulo3"/>
       </w:pPr>
-      <w:bookmarkStart w:id="81" w:name="_Toc215589466"/>
-      <w:bookmarkStart w:id="82" w:name="_Toc228797184"/>
+      <w:bookmarkStart w:id="80" w:name="_Toc215589466"/>
+      <w:bookmarkStart w:id="81" w:name="_Toc228797184"/>
       <w:r>
         <w:rPr>
           <w:lang w:val="es-ES"/>
@@ -21503,8 +21482,8 @@
       <w:r>
         <w:t>Gestión de Clientes</w:t>
       </w:r>
+      <w:bookmarkEnd w:id="80"/>
       <w:bookmarkEnd w:id="81"/>
-      <w:bookmarkEnd w:id="82"/>
     </w:p>
     <w:tbl>
       <w:tblPr>
@@ -21743,8 +21722,8 @@
           <w:lang w:val="es-ES"/>
         </w:rPr>
       </w:pPr>
-      <w:bookmarkStart w:id="83" w:name="_Toc215589467"/>
-      <w:bookmarkStart w:id="84" w:name="_Toc228797185"/>
+      <w:bookmarkStart w:id="82" w:name="_Toc215589467"/>
+      <w:bookmarkStart w:id="83" w:name="_Toc228797185"/>
       <w:r>
         <w:rPr>
           <w:lang w:val="es-ES"/>
@@ -21757,8 +21736,8 @@
         </w:rPr>
         <w:t xml:space="preserve"> Gestión de Razas</w:t>
       </w:r>
+      <w:bookmarkEnd w:id="82"/>
       <w:bookmarkEnd w:id="83"/>
-      <w:bookmarkEnd w:id="84"/>
     </w:p>
     <w:tbl>
       <w:tblPr>
@@ -22058,13 +22037,13 @@
           <w:lang w:val="es-ES"/>
         </w:rPr>
       </w:pPr>
-      <w:bookmarkStart w:id="85" w:name="_Toc215589468"/>
+      <w:bookmarkStart w:id="84" w:name="_Toc215589468"/>
     </w:p>
     <w:p>
       <w:pPr>
         <w:pStyle w:val="Ttulo3"/>
       </w:pPr>
-      <w:bookmarkStart w:id="86" w:name="_Toc228797186"/>
+      <w:bookmarkStart w:id="85" w:name="_Toc228797186"/>
       <w:r>
         <w:rPr>
           <w:lang w:val="es-ES"/>
@@ -22080,8 +22059,8 @@
       <w:r>
         <w:t>Gestión de Especies</w:t>
       </w:r>
+      <w:bookmarkEnd w:id="84"/>
       <w:bookmarkEnd w:id="85"/>
-      <w:bookmarkEnd w:id="86"/>
     </w:p>
     <w:tbl>
       <w:tblPr>
@@ -22320,8 +22299,8 @@
           <w:lang w:val="es-ES"/>
         </w:rPr>
       </w:pPr>
-      <w:bookmarkStart w:id="87" w:name="_Toc215589469"/>
-      <w:bookmarkStart w:id="88" w:name="_Toc228797187"/>
+      <w:bookmarkStart w:id="86" w:name="_Toc215589469"/>
+      <w:bookmarkStart w:id="87" w:name="_Toc228797187"/>
       <w:r>
         <w:rPr>
           <w:lang w:val="es-ES"/>
@@ -22334,14 +22313,14 @@
         </w:rPr>
         <w:t xml:space="preserve"> Gestión de Historia </w:t>
       </w:r>
+      <w:bookmarkEnd w:id="86"/>
+      <w:r>
+        <w:rPr>
+          <w:lang w:val="es-ES"/>
+        </w:rPr>
+        <w:t>Clínica</w:t>
+      </w:r>
       <w:bookmarkEnd w:id="87"/>
-      <w:r>
-        <w:rPr>
-          <w:lang w:val="es-ES"/>
-        </w:rPr>
-        <w:t>Clínica</w:t>
-      </w:r>
-      <w:bookmarkEnd w:id="88"/>
     </w:p>
     <w:tbl>
       <w:tblPr>
@@ -22592,8 +22571,8 @@
           <w:lang w:val="es-ES"/>
         </w:rPr>
       </w:pPr>
-      <w:bookmarkStart w:id="89" w:name="_Toc215589470"/>
-      <w:bookmarkStart w:id="90" w:name="_Toc228797188"/>
+      <w:bookmarkStart w:id="88" w:name="_Toc215589470"/>
+      <w:bookmarkStart w:id="89" w:name="_Toc228797188"/>
       <w:r>
         <w:rPr>
           <w:lang w:val="es-ES"/>
@@ -22606,14 +22585,14 @@
         </w:rPr>
         <w:t xml:space="preserve">10 Gestión de Detalles de Historias </w:t>
       </w:r>
+      <w:bookmarkEnd w:id="88"/>
+      <w:r>
+        <w:rPr>
+          <w:lang w:val="es-ES"/>
+        </w:rPr>
+        <w:t>Clínicas</w:t>
+      </w:r>
       <w:bookmarkEnd w:id="89"/>
-      <w:r>
-        <w:rPr>
-          <w:lang w:val="es-ES"/>
-        </w:rPr>
-        <w:t>Clínicas</w:t>
-      </w:r>
-      <w:bookmarkEnd w:id="90"/>
     </w:p>
     <w:tbl>
       <w:tblPr>
@@ -22913,13 +22892,13 @@
           <w:lang w:val="es-ES"/>
         </w:rPr>
       </w:pPr>
-      <w:bookmarkStart w:id="91" w:name="_Toc215589471"/>
+      <w:bookmarkStart w:id="90" w:name="_Toc215589471"/>
     </w:p>
     <w:p>
       <w:pPr>
         <w:pStyle w:val="Ttulo3"/>
       </w:pPr>
-      <w:bookmarkStart w:id="92" w:name="_Toc228797189"/>
+      <w:bookmarkStart w:id="91" w:name="_Toc228797189"/>
       <w:r>
         <w:rPr>
           <w:lang w:val="es-ES"/>
@@ -22935,8 +22914,8 @@
       <w:r>
         <w:t>Gestión de Stock</w:t>
       </w:r>
+      <w:bookmarkEnd w:id="90"/>
       <w:bookmarkEnd w:id="91"/>
-      <w:bookmarkEnd w:id="92"/>
     </w:p>
     <w:tbl>
       <w:tblPr>
@@ -23189,8 +23168,8 @@
       <w:pPr>
         <w:pStyle w:val="Ttulo3"/>
       </w:pPr>
-      <w:bookmarkStart w:id="93" w:name="_Toc215589474"/>
-      <w:bookmarkStart w:id="94" w:name="_Toc228797190"/>
+      <w:bookmarkStart w:id="92" w:name="_Toc215589474"/>
+      <w:bookmarkStart w:id="93" w:name="_Toc228797190"/>
       <w:r>
         <w:rPr>
           <w:lang w:val="es-ES"/>
@@ -23212,8 +23191,8 @@
       <w:r>
         <w:t>Gestión de Categorías</w:t>
       </w:r>
+      <w:bookmarkEnd w:id="92"/>
       <w:bookmarkEnd w:id="93"/>
-      <w:bookmarkEnd w:id="94"/>
     </w:p>
     <w:tbl>
       <w:tblPr>
@@ -23466,8 +23445,8 @@
       <w:pPr>
         <w:pStyle w:val="Ttulo3"/>
       </w:pPr>
-      <w:bookmarkStart w:id="95" w:name="_Toc215589475"/>
-      <w:bookmarkStart w:id="96" w:name="_Toc228797191"/>
+      <w:bookmarkStart w:id="94" w:name="_Toc215589475"/>
+      <w:bookmarkStart w:id="95" w:name="_Toc228797191"/>
       <w:r>
         <w:rPr>
           <w:lang w:val="es-ES"/>
@@ -23489,8 +23468,8 @@
       <w:r>
         <w:t>Gestión de Productos</w:t>
       </w:r>
+      <w:bookmarkEnd w:id="94"/>
       <w:bookmarkEnd w:id="95"/>
-      <w:bookmarkEnd w:id="96"/>
     </w:p>
     <w:tbl>
       <w:tblPr>
@@ -23746,8 +23725,8 @@
           <w:lang w:val="es-ES"/>
         </w:rPr>
       </w:pPr>
-      <w:bookmarkStart w:id="97" w:name="_Toc215589482"/>
-      <w:bookmarkStart w:id="98" w:name="_Toc228797192"/>
+      <w:bookmarkStart w:id="96" w:name="_Toc215589482"/>
+      <w:bookmarkStart w:id="97" w:name="_Toc228797192"/>
       <w:r>
         <w:rPr>
           <w:lang w:val="es-ES"/>
@@ -23766,8 +23745,8 @@
         </w:rPr>
         <w:t xml:space="preserve"> Gestión de Ventas</w:t>
       </w:r>
+      <w:bookmarkEnd w:id="96"/>
       <w:bookmarkEnd w:id="97"/>
-      <w:bookmarkEnd w:id="98"/>
     </w:p>
     <w:tbl>
       <w:tblPr>
@@ -24073,8 +24052,8 @@
           <w:lang w:val="es-ES"/>
         </w:rPr>
       </w:pPr>
-      <w:bookmarkStart w:id="99" w:name="_Toc215589483"/>
-      <w:bookmarkStart w:id="100" w:name="_Toc228797193"/>
+      <w:bookmarkStart w:id="98" w:name="_Toc215589483"/>
+      <w:bookmarkStart w:id="99" w:name="_Toc228797193"/>
       <w:r>
         <w:rPr>
           <w:lang w:val="es-ES"/>
@@ -24094,8 +24073,8 @@
         </w:rPr>
         <w:t xml:space="preserve"> Gestión de Detalles de Ventas</w:t>
       </w:r>
+      <w:bookmarkEnd w:id="98"/>
       <w:bookmarkEnd w:id="99"/>
-      <w:bookmarkEnd w:id="100"/>
     </w:p>
     <w:tbl>
       <w:tblPr>
@@ -24372,7 +24351,7 @@
           <w:lang w:val="es-ES"/>
         </w:rPr>
       </w:pPr>
-      <w:bookmarkStart w:id="101" w:name="_Toc228797194"/>
+      <w:bookmarkStart w:id="100" w:name="_Toc228797194"/>
       <w:r>
         <w:rPr>
           <w:lang w:val="es-ES"/>
@@ -24388,7 +24367,7 @@
       <w:r>
         <w:t>informes</w:t>
       </w:r>
-      <w:bookmarkEnd w:id="101"/>
+      <w:bookmarkEnd w:id="100"/>
     </w:p>
     <w:tbl>
       <w:tblPr>
@@ -24637,7 +24616,7 @@
           <w:lang w:val="es-ES"/>
         </w:rPr>
       </w:pPr>
-      <w:bookmarkStart w:id="102" w:name="_Toc228797195"/>
+      <w:bookmarkStart w:id="101" w:name="_Toc228797195"/>
       <w:r>
         <w:rPr>
           <w:lang w:val="es-ES"/>
@@ -24653,7 +24632,7 @@
       <w:r>
         <w:t>Auditoria</w:t>
       </w:r>
-      <w:bookmarkEnd w:id="102"/>
+      <w:bookmarkEnd w:id="101"/>
     </w:p>
     <w:tbl>
       <w:tblPr>
@@ -24924,14 +24903,55 @@
           <w:lang w:val="es-ES"/>
         </w:rPr>
       </w:pPr>
-      <w:bookmarkStart w:id="103" w:name="_Toc228797196"/>
+      <w:bookmarkStart w:id="102" w:name="_Toc228797196"/>
       <w:r>
         <w:rPr>
           <w:lang w:val="es-ES"/>
         </w:rPr>
         <w:t>6.10 Requerimientos No Funcionales</w:t>
       </w:r>
+      <w:bookmarkEnd w:id="102"/>
+    </w:p>
+    <w:p>
+      <w:pPr>
+        <w:pStyle w:val="Ttulo3"/>
+        <w:rPr>
+          <w:lang w:val="es-ES"/>
+        </w:rPr>
+      </w:pPr>
+      <w:bookmarkStart w:id="103" w:name="_Toc215589485"/>
+      <w:bookmarkStart w:id="104" w:name="_Toc228797197"/>
+      <w:r>
+        <w:rPr>
+          <w:lang w:val="es-ES"/>
+        </w:rPr>
+        <w:t xml:space="preserve">6.10.1 </w:t>
+      </w:r>
+      <w:r>
+        <w:t>Introducción</w:t>
+      </w:r>
       <w:bookmarkEnd w:id="103"/>
+      <w:bookmarkEnd w:id="104"/>
+      <w:r>
+        <w:rPr>
+          <w:lang w:val="es-ES"/>
+        </w:rPr>
+        <w:t xml:space="preserve"> </w:t>
+      </w:r>
+    </w:p>
+    <w:p>
+      <w:pPr>
+        <w:ind w:firstLine="360"/>
+        <w:rPr>
+          <w:lang w:val="es-ES"/>
+        </w:rPr>
+      </w:pPr>
+      <w:r>
+        <w:rPr>
+          <w:lang w:val="es-ES"/>
+        </w:rPr>
+        <w:t>El presente documento detalla los Requerimientos No Funcionales (RNF) que definen los criterios de calidad, eficiencia, seguridad y operatividad del Sistema de Gestión de Veterinaria. Estos requerimientos son esenciales para asegurar que el sistema cumpla con las expectativas operacionales de los usuarios (Administrador, Veterinario y Recepcionista).</w:t>
+      </w:r>
     </w:p>
     <w:p>
       <w:pPr>
@@ -24940,66 +24960,25 @@
           <w:lang w:val="es-ES"/>
         </w:rPr>
       </w:pPr>
-      <w:bookmarkStart w:id="104" w:name="_Toc215589485"/>
-      <w:bookmarkStart w:id="105" w:name="_Toc228797197"/>
+      <w:bookmarkStart w:id="105" w:name="_Toc215589486"/>
+      <w:bookmarkStart w:id="106" w:name="_Toc228797198"/>
       <w:r>
         <w:rPr>
           <w:lang w:val="es-ES"/>
         </w:rPr>
-        <w:t xml:space="preserve">6.10.1 </w:t>
-      </w:r>
-      <w:r>
-        <w:t>Introducción</w:t>
-      </w:r>
-      <w:bookmarkEnd w:id="104"/>
+        <w:t>6.10.2</w:t>
+      </w:r>
+      <w:r>
+        <w:rPr>
+          <w:lang w:val="es-ES"/>
+        </w:rPr>
+        <w:t xml:space="preserve"> </w:t>
+      </w:r>
+      <w:r>
+        <w:t>Rendimiento</w:t>
+      </w:r>
       <w:bookmarkEnd w:id="105"/>
-      <w:r>
-        <w:rPr>
-          <w:lang w:val="es-ES"/>
-        </w:rPr>
-        <w:t xml:space="preserve"> </w:t>
-      </w:r>
-    </w:p>
-    <w:p>
-      <w:pPr>
-        <w:ind w:firstLine="360"/>
-        <w:rPr>
-          <w:lang w:val="es-ES"/>
-        </w:rPr>
-      </w:pPr>
-      <w:r>
-        <w:rPr>
-          <w:lang w:val="es-ES"/>
-        </w:rPr>
-        <w:t>El presente documento detalla los Requerimientos No Funcionales (RNF) que definen los criterios de calidad, eficiencia, seguridad y operatividad del Sistema de Gestión de Veterinaria. Estos requerimientos son esenciales para asegurar que el sistema cumpla con las expectativas operacionales de los usuarios (Administrador, Veterinario y Recepcionista).</w:t>
-      </w:r>
-    </w:p>
-    <w:p>
-      <w:pPr>
-        <w:pStyle w:val="Ttulo3"/>
-        <w:rPr>
-          <w:lang w:val="es-ES"/>
-        </w:rPr>
-      </w:pPr>
-      <w:bookmarkStart w:id="106" w:name="_Toc215589486"/>
-      <w:bookmarkStart w:id="107" w:name="_Toc228797198"/>
-      <w:r>
-        <w:rPr>
-          <w:lang w:val="es-ES"/>
-        </w:rPr>
-        <w:t>6.10.2</w:t>
-      </w:r>
-      <w:r>
-        <w:rPr>
-          <w:lang w:val="es-ES"/>
-        </w:rPr>
-        <w:t xml:space="preserve"> </w:t>
-      </w:r>
-      <w:r>
-        <w:t>Rendimiento</w:t>
-      </w:r>
       <w:bookmarkEnd w:id="106"/>
-      <w:bookmarkEnd w:id="107"/>
     </w:p>
     <w:tbl>
       <w:tblPr>
@@ -25580,8 +25559,8 @@
           <w:lang w:val="es-ES"/>
         </w:rPr>
       </w:pPr>
-      <w:bookmarkStart w:id="108" w:name="_Toc215589487"/>
-      <w:bookmarkStart w:id="109" w:name="_Toc228797199"/>
+      <w:bookmarkStart w:id="107" w:name="_Toc215589487"/>
+      <w:bookmarkStart w:id="108" w:name="_Toc228797199"/>
       <w:r>
         <w:rPr>
           <w:lang w:val="es-ES"/>
@@ -25600,8 +25579,8 @@
         </w:rPr>
         <w:t>Seguridad</w:t>
       </w:r>
+      <w:bookmarkEnd w:id="107"/>
       <w:bookmarkEnd w:id="108"/>
-      <w:bookmarkEnd w:id="109"/>
     </w:p>
     <w:tbl>
       <w:tblPr>
@@ -26271,8 +26250,8 @@
       <w:pPr>
         <w:pStyle w:val="Ttulo3"/>
       </w:pPr>
-      <w:bookmarkStart w:id="110" w:name="_Toc215589488"/>
-      <w:bookmarkStart w:id="111" w:name="_Toc228797200"/>
+      <w:bookmarkStart w:id="109" w:name="_Toc215589488"/>
+      <w:bookmarkStart w:id="110" w:name="_Toc228797200"/>
       <w:r>
         <w:rPr>
           <w:lang w:val="es-ES"/>
@@ -26285,8 +26264,8 @@
       <w:r>
         <w:t>Fiabilidad/Disponibilidad</w:t>
       </w:r>
+      <w:bookmarkEnd w:id="109"/>
       <w:bookmarkEnd w:id="110"/>
-      <w:bookmarkEnd w:id="111"/>
       <w:r>
         <w:t xml:space="preserve"> </w:t>
       </w:r>
@@ -26753,8 +26732,8 @@
       <w:pPr>
         <w:pStyle w:val="Ttulo3"/>
       </w:pPr>
-      <w:bookmarkStart w:id="112" w:name="_Toc215589489"/>
-      <w:bookmarkStart w:id="113" w:name="_Toc228797201"/>
+      <w:bookmarkStart w:id="111" w:name="_Toc215589489"/>
+      <w:bookmarkStart w:id="112" w:name="_Toc228797201"/>
       <w:r>
         <w:rPr>
           <w:lang w:val="es-ES"/>
@@ -26767,8 +26746,8 @@
       <w:r>
         <w:t>Usabilidad</w:t>
       </w:r>
+      <w:bookmarkEnd w:id="111"/>
       <w:bookmarkEnd w:id="112"/>
-      <w:bookmarkEnd w:id="113"/>
     </w:p>
     <w:tbl>
       <w:tblPr>
@@ -27336,8 +27315,8 @@
       <w:pPr>
         <w:pStyle w:val="Ttulo3"/>
       </w:pPr>
-      <w:bookmarkStart w:id="114" w:name="_Toc215589490"/>
-      <w:bookmarkStart w:id="115" w:name="_Toc228797202"/>
+      <w:bookmarkStart w:id="113" w:name="_Toc215589490"/>
+      <w:bookmarkStart w:id="114" w:name="_Toc228797202"/>
       <w:r>
         <w:lastRenderedPageBreak/>
         <w:t>6.10.6</w:t>
@@ -27348,8 +27327,8 @@
       <w:r>
         <w:t>Mantenibilidad</w:t>
       </w:r>
+      <w:bookmarkEnd w:id="113"/>
       <w:bookmarkEnd w:id="114"/>
-      <w:bookmarkEnd w:id="115"/>
     </w:p>
     <w:tbl>
       <w:tblPr>
@@ -27867,14 +27846,14 @@
           <w:lang w:val="es-ES"/>
         </w:rPr>
       </w:pPr>
-      <w:bookmarkStart w:id="116" w:name="_Toc228797203"/>
+      <w:bookmarkStart w:id="115" w:name="_Toc228797203"/>
       <w:r>
         <w:rPr>
           <w:lang w:val="es-ES"/>
         </w:rPr>
         <w:t>6.11 Matriz de la Trazabilidad</w:t>
       </w:r>
-      <w:bookmarkEnd w:id="116"/>
+      <w:bookmarkEnd w:id="115"/>
     </w:p>
     <w:tbl>
       <w:tblPr>
@@ -28343,7 +28322,7 @@
           <w:lang w:val="es-ES"/>
         </w:rPr>
       </w:pPr>
-      <w:bookmarkStart w:id="117" w:name="_Toc228797204"/>
+      <w:bookmarkStart w:id="116" w:name="_Toc228797204"/>
       <w:r>
         <w:rPr>
           <w:lang w:val="es-ES"/>
@@ -28353,7 +28332,7 @@
       <w:r>
         <w:t>Restricciones y Limitaciones</w:t>
       </w:r>
-      <w:bookmarkEnd w:id="117"/>
+      <w:bookmarkEnd w:id="116"/>
     </w:p>
     <w:p>
       <w:pPr>
@@ -28518,11 +28497,11 @@
       <w:pPr>
         <w:pStyle w:val="Ttulo2"/>
       </w:pPr>
-      <w:bookmarkStart w:id="118" w:name="_Toc228797205"/>
+      <w:bookmarkStart w:id="117" w:name="_Toc228797205"/>
       <w:r>
         <w:t>6.13 Mejoras a Futuro</w:t>
       </w:r>
-      <w:bookmarkEnd w:id="118"/>
+      <w:bookmarkEnd w:id="117"/>
     </w:p>
     <w:p>
       <w:pPr>
@@ -28662,16 +28641,16 @@
           <w:lang w:val="es-ES"/>
         </w:rPr>
       </w:pPr>
-      <w:bookmarkStart w:id="119" w:name="_Toc215589519"/>
-      <w:bookmarkStart w:id="120" w:name="_Toc228797206"/>
+      <w:bookmarkStart w:id="118" w:name="_Toc215589519"/>
+      <w:bookmarkStart w:id="119" w:name="_Toc228797206"/>
       <w:r>
         <w:t xml:space="preserve">6.14 </w:t>
       </w:r>
       <w:r>
         <w:t>Modelo Relacional</w:t>
       </w:r>
+      <w:bookmarkEnd w:id="118"/>
       <w:bookmarkEnd w:id="119"/>
-      <w:bookmarkEnd w:id="120"/>
     </w:p>
     <w:p>
       <w:pPr>
@@ -28856,7 +28835,7 @@
         </w:rPr>
         <w:lastRenderedPageBreak/>
         <w:drawing>
-          <wp:anchor distT="0" distB="0" distL="114300" distR="114300" simplePos="0" relativeHeight="251665408" behindDoc="0" locked="0" layoutInCell="1" allowOverlap="1" wp14:anchorId="38C8E3FA" wp14:editId="0DDEBB3A">
+          <wp:anchor distT="0" distB="0" distL="114300" distR="114300" simplePos="0" relativeHeight="251665408" behindDoc="0" locked="0" layoutInCell="1" allowOverlap="1" wp14:anchorId="0C1F7E5A" wp14:editId="2F3EFF2A">
             <wp:simplePos x="0" y="0"/>
             <wp:positionH relativeFrom="column">
               <wp:posOffset>-1053465</wp:posOffset>
@@ -28938,22 +28917,22 @@
       <w:pPr>
         <w:pStyle w:val="Ttulo1"/>
       </w:pPr>
-      <w:bookmarkStart w:id="121" w:name="_Toc228797207"/>
+      <w:bookmarkStart w:id="120" w:name="_Toc228797207"/>
       <w:r>
         <w:lastRenderedPageBreak/>
         <w:t>7. METODOLOGÍA</w:t>
       </w:r>
+      <w:bookmarkEnd w:id="120"/>
+    </w:p>
+    <w:p>
+      <w:pPr>
+        <w:pStyle w:val="Ttulo2"/>
+      </w:pPr>
+      <w:bookmarkStart w:id="121" w:name="_Toc228797208"/>
+      <w:r>
+        <w:t>7.1 Enfoque Metodológico</w:t>
+      </w:r>
       <w:bookmarkEnd w:id="121"/>
-    </w:p>
-    <w:p>
-      <w:pPr>
-        <w:pStyle w:val="Ttulo2"/>
-      </w:pPr>
-      <w:bookmarkStart w:id="122" w:name="_Toc228797208"/>
-      <w:r>
-        <w:t>7.1 Enfoque Metodológico</w:t>
-      </w:r>
-      <w:bookmarkEnd w:id="122"/>
     </w:p>
     <w:p>
       <w:pPr>
@@ -29097,21 +29076,21 @@
       <w:pPr>
         <w:pStyle w:val="Ttulo2"/>
       </w:pPr>
-      <w:bookmarkStart w:id="123" w:name="_Toc228797209"/>
+      <w:bookmarkStart w:id="122" w:name="_Toc228797209"/>
       <w:r>
         <w:t>7.2 Técnicas y Herramientas Utilizadas</w:t>
       </w:r>
+      <w:bookmarkEnd w:id="122"/>
+    </w:p>
+    <w:p>
+      <w:pPr>
+        <w:pStyle w:val="Ttulo3"/>
+      </w:pPr>
+      <w:bookmarkStart w:id="123" w:name="_Toc228797210"/>
+      <w:r>
+        <w:t>7.2.1 Modelado del sistema</w:t>
+      </w:r>
       <w:bookmarkEnd w:id="123"/>
-    </w:p>
-    <w:p>
-      <w:pPr>
-        <w:pStyle w:val="Ttulo3"/>
-      </w:pPr>
-      <w:bookmarkStart w:id="124" w:name="_Toc228797210"/>
-      <w:r>
-        <w:t>7.2.1 Modelado del sistema</w:t>
-      </w:r>
-      <w:bookmarkEnd w:id="124"/>
       <w:r>
         <w:t xml:space="preserve"> </w:t>
       </w:r>
@@ -29163,11 +29142,11 @@
       <w:pPr>
         <w:pStyle w:val="Ttulo3"/>
       </w:pPr>
-      <w:bookmarkStart w:id="125" w:name="_Toc228797211"/>
+      <w:bookmarkStart w:id="124" w:name="_Toc228797211"/>
       <w:r>
         <w:t>7.2.2 Tecnologías implementadas</w:t>
       </w:r>
-      <w:bookmarkEnd w:id="125"/>
+      <w:bookmarkEnd w:id="124"/>
     </w:p>
     <w:p>
       <w:pPr>
@@ -29330,11 +29309,11 @@
       <w:pPr>
         <w:pStyle w:val="Ttulo2"/>
       </w:pPr>
-      <w:bookmarkStart w:id="126" w:name="_Toc228797212"/>
+      <w:bookmarkStart w:id="125" w:name="_Toc228797212"/>
       <w:r>
         <w:t>7.3 Diseño del Sistema y Arquitectura</w:t>
       </w:r>
-      <w:bookmarkEnd w:id="126"/>
+      <w:bookmarkEnd w:id="125"/>
     </w:p>
     <w:p>
       <w:pPr>
@@ -29430,12 +29409,12 @@
       <w:pPr>
         <w:pStyle w:val="Ttulo2"/>
       </w:pPr>
-      <w:bookmarkStart w:id="127" w:name="_Toc228797213"/>
+      <w:bookmarkStart w:id="126" w:name="_Toc228797213"/>
       <w:r>
         <w:lastRenderedPageBreak/>
         <w:t>7.4 Desarrollo e Implementación</w:t>
       </w:r>
-      <w:bookmarkEnd w:id="127"/>
+      <w:bookmarkEnd w:id="126"/>
     </w:p>
     <w:p>
       <w:pPr>
@@ -29497,11 +29476,11 @@
       <w:pPr>
         <w:pStyle w:val="Ttulo2"/>
       </w:pPr>
-      <w:bookmarkStart w:id="128" w:name="_Toc228797214"/>
+      <w:bookmarkStart w:id="127" w:name="_Toc228797214"/>
       <w:r>
         <w:t>7.5 Base de Datos</w:t>
       </w:r>
-      <w:bookmarkEnd w:id="128"/>
+      <w:bookmarkEnd w:id="127"/>
     </w:p>
     <w:p>
       <w:pPr>
@@ -29561,11 +29540,11 @@
       <w:pPr>
         <w:pStyle w:val="Ttulo2"/>
       </w:pPr>
-      <w:bookmarkStart w:id="129" w:name="_Toc228797215"/>
+      <w:bookmarkStart w:id="128" w:name="_Toc228797215"/>
       <w:r>
         <w:t>7.6 Gestión de Versiones y Colaboración</w:t>
       </w:r>
-      <w:bookmarkEnd w:id="129"/>
+      <w:bookmarkEnd w:id="128"/>
     </w:p>
     <w:p>
       <w:pPr>
@@ -29621,11 +29600,11 @@
       <w:pPr>
         <w:pStyle w:val="Ttulo2"/>
       </w:pPr>
-      <w:bookmarkStart w:id="130" w:name="_Toc228797216"/>
+      <w:bookmarkStart w:id="129" w:name="_Toc228797216"/>
       <w:r>
         <w:t>7.7 Pruebas e Integración</w:t>
       </w:r>
-      <w:bookmarkEnd w:id="130"/>
+      <w:bookmarkEnd w:id="129"/>
     </w:p>
     <w:p>
       <w:r>
@@ -29660,11 +29639,11 @@
       <w:pPr>
         <w:pStyle w:val="Ttulo2"/>
       </w:pPr>
-      <w:bookmarkStart w:id="131" w:name="_Toc228797217"/>
+      <w:bookmarkStart w:id="130" w:name="_Toc228797217"/>
       <w:r>
         <w:t>7.8 Implantación y Capacitación</w:t>
       </w:r>
-      <w:bookmarkEnd w:id="131"/>
+      <w:bookmarkEnd w:id="130"/>
     </w:p>
     <w:p>
       <w:r>
@@ -29686,21 +29665,21 @@
       <w:pPr>
         <w:pStyle w:val="Ttulo1"/>
       </w:pPr>
-      <w:bookmarkStart w:id="132" w:name="_Toc228797218"/>
+      <w:bookmarkStart w:id="131" w:name="_Toc228797218"/>
       <w:r>
         <w:t>8. RECURSOS NECESARIOS</w:t>
       </w:r>
+      <w:bookmarkEnd w:id="131"/>
+    </w:p>
+    <w:p>
+      <w:pPr>
+        <w:pStyle w:val="Ttulo2"/>
+      </w:pPr>
+      <w:bookmarkStart w:id="132" w:name="_Toc228797219"/>
+      <w:r>
+        <w:t>8.1 Recursos Humanos</w:t>
+      </w:r>
       <w:bookmarkEnd w:id="132"/>
-    </w:p>
-    <w:p>
-      <w:pPr>
-        <w:pStyle w:val="Ttulo2"/>
-      </w:pPr>
-      <w:bookmarkStart w:id="133" w:name="_Toc228797219"/>
-      <w:r>
-        <w:t>8.1 Recursos Humanos</w:t>
-      </w:r>
-      <w:bookmarkEnd w:id="133"/>
     </w:p>
     <w:p>
       <w:pPr>
@@ -29820,11 +29799,11 @@
       <w:pPr>
         <w:pStyle w:val="Ttulo2"/>
       </w:pPr>
-      <w:bookmarkStart w:id="134" w:name="_Toc228797220"/>
+      <w:bookmarkStart w:id="133" w:name="_Toc228797220"/>
       <w:r>
         <w:t>8.2 Recursos Materiales (Hardware y Software)</w:t>
       </w:r>
-      <w:bookmarkEnd w:id="134"/>
+      <w:bookmarkEnd w:id="133"/>
     </w:p>
     <w:p>
       <w:r>
@@ -30030,14 +30009,14 @@
           <w:lang w:val="es-ES"/>
         </w:rPr>
       </w:pPr>
-      <w:bookmarkStart w:id="135" w:name="_Toc228797221"/>
+      <w:bookmarkStart w:id="134" w:name="_Toc228797221"/>
       <w:r>
         <w:rPr>
           <w:lang w:val="es-ES"/>
         </w:rPr>
         <w:t>8.3 Descripción del Equipo de Trabajo (Roles):</w:t>
       </w:r>
-      <w:bookmarkEnd w:id="135"/>
+      <w:bookmarkEnd w:id="134"/>
     </w:p>
     <w:p>
       <w:pPr>
@@ -31666,24 +31645,24 @@
           <w:lang w:val="es-ES"/>
         </w:rPr>
       </w:pPr>
-      <w:bookmarkStart w:id="136" w:name="_Toc228797222"/>
+      <w:bookmarkStart w:id="135" w:name="_Toc228797222"/>
       <w:r>
         <w:rPr>
           <w:lang w:val="es-ES"/>
         </w:rPr>
         <w:t>9. PLAN DE TRABAJO</w:t>
       </w:r>
+      <w:bookmarkEnd w:id="135"/>
+    </w:p>
+    <w:p>
+      <w:pPr>
+        <w:pStyle w:val="Ttulo2"/>
+      </w:pPr>
+      <w:bookmarkStart w:id="136" w:name="_Toc228797223"/>
+      <w:r>
+        <w:t>9.1 Versión Descriptiva</w:t>
+      </w:r>
       <w:bookmarkEnd w:id="136"/>
-    </w:p>
-    <w:p>
-      <w:pPr>
-        <w:pStyle w:val="Ttulo2"/>
-      </w:pPr>
-      <w:bookmarkStart w:id="137" w:name="_Toc228797223"/>
-      <w:r>
-        <w:t>9.1 Versión Descriptiva</w:t>
-      </w:r>
-      <w:bookmarkEnd w:id="137"/>
     </w:p>
     <w:p>
       <w:pPr>
@@ -31707,8 +31686,8 @@
       <w:pPr>
         <w:pStyle w:val="Ttulo2"/>
       </w:pPr>
-      <w:bookmarkStart w:id="138" w:name="_Toc215589520"/>
-      <w:bookmarkStart w:id="139" w:name="_Toc228797224"/>
+      <w:bookmarkStart w:id="137" w:name="_Toc215589520"/>
+      <w:bookmarkStart w:id="138" w:name="_Toc228797224"/>
       <w:r>
         <w:t xml:space="preserve">9.2 </w:t>
       </w:r>
@@ -31718,8 +31697,8 @@
       <w:r>
         <w:t xml:space="preserve"> de Gantt</w:t>
       </w:r>
+      <w:bookmarkEnd w:id="137"/>
       <w:bookmarkEnd w:id="138"/>
-      <w:bookmarkEnd w:id="139"/>
     </w:p>
     <w:p>
       <w:pPr>
@@ -32903,7 +32882,7 @@
       <w:pPr>
         <w:pStyle w:val="Ttulo2"/>
       </w:pPr>
-      <w:bookmarkStart w:id="140" w:name="_Toc215589521"/>
+      <w:bookmarkStart w:id="139" w:name="_Toc215589521"/>
     </w:p>
     <w:p>
       <w:pPr>
@@ -32977,7 +32956,7 @@
         </w:rPr>
         <w:lastRenderedPageBreak/>
         <w:drawing>
-          <wp:anchor distT="0" distB="0" distL="114300" distR="114300" simplePos="0" relativeHeight="251666432" behindDoc="0" locked="0" layoutInCell="1" allowOverlap="1" wp14:anchorId="34C14589" wp14:editId="75956BB6">
+          <wp:anchor distT="0" distB="0" distL="114300" distR="114300" simplePos="0" relativeHeight="251666432" behindDoc="0" locked="0" layoutInCell="1" allowOverlap="1" wp14:anchorId="1ECFB824" wp14:editId="21D7F44D">
             <wp:simplePos x="0" y="0"/>
             <wp:positionH relativeFrom="column">
               <wp:posOffset>-2101850</wp:posOffset>
@@ -33037,7 +33016,7 @@
       <w:pPr>
         <w:pStyle w:val="Ttulo3"/>
       </w:pPr>
-      <w:bookmarkStart w:id="141" w:name="_Toc228797225"/>
+      <w:bookmarkStart w:id="140" w:name="_Toc228797225"/>
       <w:r>
         <w:lastRenderedPageBreak/>
         <w:t>9.</w:t>
@@ -33054,7 +33033,7 @@
       <w:r>
         <w:t xml:space="preserve"> de Actividades (Diagrama de Gantt)</w:t>
       </w:r>
-      <w:bookmarkEnd w:id="141"/>
+      <w:bookmarkEnd w:id="140"/>
     </w:p>
     <w:tbl>
       <w:tblPr>
@@ -34560,11 +34539,11 @@
       <w:pPr>
         <w:pStyle w:val="Ttulo2"/>
       </w:pPr>
-      <w:bookmarkStart w:id="142" w:name="_Toc228797226"/>
+      <w:bookmarkStart w:id="141" w:name="_Toc228797226"/>
       <w:r>
         <w:t>9.3 Etapas y entregables</w:t>
       </w:r>
-      <w:bookmarkEnd w:id="142"/>
+      <w:bookmarkEnd w:id="141"/>
     </w:p>
     <w:p>
       <w:pPr>
@@ -34661,6 +34640,7 @@
           </w:tcPr>
           <w:p>
             <w:r>
+              <w:lastRenderedPageBreak/>
               <w:t>1. Análisis</w:t>
             </w:r>
           </w:p>
@@ -34941,7 +34921,7 @@
       <w:pPr>
         <w:pStyle w:val="Ttulo2"/>
       </w:pPr>
-      <w:bookmarkStart w:id="143" w:name="_Toc228797227"/>
+      <w:bookmarkStart w:id="142" w:name="_Toc228797227"/>
       <w:r>
         <w:t>9</w:t>
       </w:r>
@@ -34960,8 +34940,8 @@
       <w:r>
         <w:t xml:space="preserve"> UML clases</w:t>
       </w:r>
-      <w:bookmarkEnd w:id="140"/>
-      <w:bookmarkEnd w:id="143"/>
+      <w:bookmarkEnd w:id="139"/>
+      <w:bookmarkEnd w:id="142"/>
       <w:r>
         <w:t xml:space="preserve"> </w:t>
       </w:r>
@@ -35026,7 +35006,6 @@
           <w:b/>
           <w:bCs/>
         </w:rPr>
-        <w:lastRenderedPageBreak/>
         <w:t>Jerarquía de Clasificación:</w:t>
       </w:r>
       <w:r>
@@ -35161,6 +35140,7 @@
           <w:b/>
           <w:bCs/>
         </w:rPr>
+        <w:lastRenderedPageBreak/>
         <w:t>3. Módulo Comercial (Inventario y Transacciones)</w:t>
       </w:r>
       <w:r>
@@ -35331,7 +35311,7 @@
         </w:rPr>
         <w:lastRenderedPageBreak/>
         <w:drawing>
-          <wp:anchor distT="0" distB="0" distL="114300" distR="114300" simplePos="0" relativeHeight="251667456" behindDoc="0" locked="0" layoutInCell="1" allowOverlap="1" wp14:anchorId="0052283F" wp14:editId="6ADEA791">
+          <wp:anchor distT="0" distB="0" distL="114300" distR="114300" simplePos="0" relativeHeight="251667456" behindDoc="0" locked="0" layoutInCell="1" allowOverlap="1" wp14:anchorId="74C402CA" wp14:editId="1EABF0E7">
             <wp:simplePos x="0" y="0"/>
             <wp:positionH relativeFrom="column">
               <wp:posOffset>-698500</wp:posOffset>
@@ -35458,8 +35438,8 @@
       <w:pPr>
         <w:pStyle w:val="Ttulo2"/>
       </w:pPr>
-      <w:bookmarkStart w:id="144" w:name="_Toc215589522"/>
-      <w:bookmarkStart w:id="145" w:name="_Toc228797228"/>
+      <w:bookmarkStart w:id="143" w:name="_Toc215589522"/>
+      <w:bookmarkStart w:id="144" w:name="_Toc228797228"/>
       <w:r>
         <w:t>9.</w:t>
       </w:r>
@@ -35472,8 +35452,8 @@
       <w:r>
         <w:t>Prototipos de interfaz</w:t>
       </w:r>
+      <w:bookmarkEnd w:id="143"/>
       <w:bookmarkEnd w:id="144"/>
-      <w:bookmarkEnd w:id="145"/>
       <w:r>
         <w:br/>
       </w:r>
@@ -35542,8 +35522,8 @@
       <w:pPr>
         <w:pStyle w:val="Ttulo3"/>
       </w:pPr>
-      <w:bookmarkStart w:id="146" w:name="_Toc215589523"/>
-      <w:bookmarkStart w:id="147" w:name="_Toc228797229"/>
+      <w:bookmarkStart w:id="145" w:name="_Toc215589523"/>
+      <w:bookmarkStart w:id="146" w:name="_Toc228797229"/>
       <w:r>
         <w:t>9.</w:t>
       </w:r>
@@ -35553,8 +35533,8 @@
       <w:r>
         <w:t>.1 Página Principal (Dashboard o Home)</w:t>
       </w:r>
+      <w:bookmarkEnd w:id="145"/>
       <w:bookmarkEnd w:id="146"/>
-      <w:bookmarkEnd w:id="147"/>
     </w:p>
     <w:p>
       <w:pPr>
@@ -35588,7 +35568,7 @@
           <w:lang w:val="es-ES" w:eastAsia="es-ES"/>
         </w:rPr>
         <w:drawing>
-          <wp:inline distT="0" distB="0" distL="0" distR="0" wp14:anchorId="7ACF45BB" wp14:editId="7CB32046">
+          <wp:inline distT="0" distB="0" distL="0" distR="0" wp14:anchorId="45458896" wp14:editId="1795C4F3">
             <wp:extent cx="5571461" cy="2679065"/>
             <wp:effectExtent l="0" t="0" r="0" b="6985"/>
             <wp:docPr id="1" name="Imagen 1"/>
@@ -35628,8 +35608,8 @@
       <w:pPr>
         <w:pStyle w:val="Ttulo3"/>
       </w:pPr>
-      <w:bookmarkStart w:id="148" w:name="_Toc215589524"/>
-      <w:bookmarkStart w:id="149" w:name="_Toc228797230"/>
+      <w:bookmarkStart w:id="147" w:name="_Toc215589524"/>
+      <w:bookmarkStart w:id="148" w:name="_Toc228797230"/>
       <w:r>
         <w:t>9.</w:t>
       </w:r>
@@ -35645,8 +35625,8 @@
       <w:r>
         <w:t>Menú de Navegación</w:t>
       </w:r>
+      <w:bookmarkEnd w:id="147"/>
       <w:bookmarkEnd w:id="148"/>
-      <w:bookmarkEnd w:id="149"/>
     </w:p>
     <w:p>
       <w:pPr>
@@ -35681,7 +35661,7 @@
         </w:rPr>
         <w:lastRenderedPageBreak/>
         <w:drawing>
-          <wp:inline distT="0" distB="0" distL="0" distR="0" wp14:anchorId="7EEA1BAE" wp14:editId="7634E4F5">
+          <wp:inline distT="0" distB="0" distL="0" distR="0" wp14:anchorId="67B16BAD" wp14:editId="1C7CBE0A">
             <wp:extent cx="6007396" cy="2714772"/>
             <wp:effectExtent l="0" t="0" r="0" b="9525"/>
             <wp:docPr id="4" name="Imagen 4"/>
@@ -35731,8 +35711,8 @@
       <w:pPr>
         <w:pStyle w:val="Ttulo3"/>
       </w:pPr>
-      <w:bookmarkStart w:id="150" w:name="_Toc215589525"/>
-      <w:bookmarkStart w:id="151" w:name="_Toc228797231"/>
+      <w:bookmarkStart w:id="149" w:name="_Toc215589525"/>
+      <w:bookmarkStart w:id="150" w:name="_Toc228797231"/>
       <w:r>
         <w:t>9.</w:t>
       </w:r>
@@ -35748,8 +35728,8 @@
       <w:r>
         <w:t>Modal de Gestión (Crear/Editar/Configurar)</w:t>
       </w:r>
+      <w:bookmarkEnd w:id="149"/>
       <w:bookmarkEnd w:id="150"/>
-      <w:bookmarkEnd w:id="151"/>
     </w:p>
     <w:p>
       <w:pPr>
@@ -35793,7 +35773,7 @@
           <w:lang w:val="es-ES" w:eastAsia="es-ES"/>
         </w:rPr>
         <w:drawing>
-          <wp:inline distT="0" distB="0" distL="0" distR="0" wp14:anchorId="664089DB" wp14:editId="54F58454">
+          <wp:inline distT="0" distB="0" distL="0" distR="0" wp14:anchorId="78935893" wp14:editId="47BA0287">
             <wp:extent cx="6103089" cy="2724286"/>
             <wp:effectExtent l="0" t="0" r="0" b="0"/>
             <wp:docPr id="5" name="Imagen 5"/>
@@ -35846,8 +35826,8 @@
           <w:noProof/>
         </w:rPr>
       </w:pPr>
-      <w:bookmarkStart w:id="152" w:name="_Toc215589526"/>
-      <w:bookmarkStart w:id="153" w:name="_Toc228797232"/>
+      <w:bookmarkStart w:id="151" w:name="_Toc215589526"/>
+      <w:bookmarkStart w:id="152" w:name="_Toc228797232"/>
       <w:r>
         <w:lastRenderedPageBreak/>
         <w:t>9.</w:t>
@@ -35858,8 +35838,8 @@
       <w:r>
         <w:t>.4 Vista de Detalles (Ver un elemento específico)</w:t>
       </w:r>
+      <w:bookmarkEnd w:id="151"/>
       <w:bookmarkEnd w:id="152"/>
-      <w:bookmarkEnd w:id="153"/>
       <w:r>
         <w:rPr>
           <w:noProof/>
@@ -35911,7 +35891,7 @@
           <w:lang w:val="es-ES" w:eastAsia="es-ES"/>
         </w:rPr>
         <w:drawing>
-          <wp:inline distT="0" distB="0" distL="0" distR="0" wp14:anchorId="69E26853" wp14:editId="2DC921E1">
+          <wp:inline distT="0" distB="0" distL="0" distR="0" wp14:anchorId="45FFCA16" wp14:editId="00F88E0E">
             <wp:extent cx="6049926" cy="2613050"/>
             <wp:effectExtent l="0" t="0" r="8255" b="0"/>
             <wp:docPr id="6" name="Imagen 6"/>
@@ -35961,8 +35941,8 @@
       <w:pPr>
         <w:pStyle w:val="Ttulo2"/>
       </w:pPr>
-      <w:bookmarkStart w:id="154" w:name="_Toc215589527"/>
-      <w:bookmarkStart w:id="155" w:name="_Toc228797233"/>
+      <w:bookmarkStart w:id="153" w:name="_Toc215589527"/>
+      <w:bookmarkStart w:id="154" w:name="_Toc228797233"/>
       <w:r>
         <w:t>9.</w:t>
       </w:r>
@@ -35972,26 +35952,26 @@
       <w:r>
         <w:t xml:space="preserve"> Arquitectura del sistema</w:t>
       </w:r>
+      <w:bookmarkEnd w:id="153"/>
       <w:bookmarkEnd w:id="154"/>
+    </w:p>
+    <w:p>
+      <w:pPr>
+        <w:pStyle w:val="Ttulo3"/>
+      </w:pPr>
+      <w:bookmarkStart w:id="155" w:name="_Toc215589528"/>
+      <w:bookmarkStart w:id="156" w:name="_Toc228797234"/>
+      <w:r>
+        <w:t>9.</w:t>
+      </w:r>
+      <w:r>
+        <w:t>6</w:t>
+      </w:r>
+      <w:r>
+        <w:t>.1 Patrón Arquitectónico (MVC / Cliente-Servidor)</w:t>
+      </w:r>
       <w:bookmarkEnd w:id="155"/>
-    </w:p>
-    <w:p>
-      <w:pPr>
-        <w:pStyle w:val="Ttulo3"/>
-      </w:pPr>
-      <w:bookmarkStart w:id="156" w:name="_Toc215589528"/>
-      <w:bookmarkStart w:id="157" w:name="_Toc228797234"/>
-      <w:r>
-        <w:t>9.</w:t>
-      </w:r>
-      <w:r>
-        <w:t>6</w:t>
-      </w:r>
-      <w:r>
-        <w:t>.1 Patrón Arquitectónico (MVC / Cliente-Servidor)</w:t>
-      </w:r>
       <w:bookmarkEnd w:id="156"/>
-      <w:bookmarkEnd w:id="157"/>
     </w:p>
     <w:p>
       <w:pPr>
@@ -36035,8 +36015,8 @@
       <w:pPr>
         <w:pStyle w:val="Ttulo3"/>
       </w:pPr>
-      <w:bookmarkStart w:id="158" w:name="_Toc215589529"/>
-      <w:bookmarkStart w:id="159" w:name="_Toc228797235"/>
+      <w:bookmarkStart w:id="157" w:name="_Toc215589529"/>
+      <w:bookmarkStart w:id="158" w:name="_Toc228797235"/>
       <w:r>
         <w:t>9.</w:t>
       </w:r>
@@ -36046,8 +36026,8 @@
       <w:r>
         <w:t>.2 Diagrama de Arquitectura (Nivel Alto)</w:t>
       </w:r>
+      <w:bookmarkEnd w:id="157"/>
       <w:bookmarkEnd w:id="158"/>
-      <w:bookmarkEnd w:id="159"/>
     </w:p>
     <w:p>
       <w:pPr>
@@ -36180,7 +36160,7 @@
         </w:rPr>
         <w:lastRenderedPageBreak/>
         <w:drawing>
-          <wp:inline distT="0" distB="0" distL="0" distR="0" wp14:anchorId="18257388" wp14:editId="6FCDE41F">
+          <wp:inline distT="0" distB="0" distL="0" distR="0" wp14:anchorId="5A6E5D51" wp14:editId="56FEC90A">
             <wp:extent cx="5819887" cy="3178217"/>
             <wp:effectExtent l="0" t="0" r="9525" b="3175"/>
             <wp:docPr id="9" name="Imagen 9"/>
@@ -36243,8 +36223,8 @@
       <w:pPr>
         <w:pStyle w:val="Ttulo3"/>
       </w:pPr>
-      <w:bookmarkStart w:id="160" w:name="_Toc215589530"/>
-      <w:bookmarkStart w:id="161" w:name="_Toc228797236"/>
+      <w:bookmarkStart w:id="159" w:name="_Toc215589530"/>
+      <w:bookmarkStart w:id="160" w:name="_Toc228797236"/>
       <w:r>
         <w:t>9.</w:t>
       </w:r>
@@ -36254,15 +36234,15 @@
       <w:r>
         <w:t>.3 Descripción de Componentes (El Stack Tecnológico)</w:t>
       </w:r>
+      <w:bookmarkEnd w:id="159"/>
       <w:bookmarkEnd w:id="160"/>
+    </w:p>
+    <w:p>
+      <w:bookmarkStart w:id="161" w:name="_Toc215589531"/>
+      <w:r>
+        <w:t>A. Capa de Cliente (Frontend - React)</w:t>
+      </w:r>
       <w:bookmarkEnd w:id="161"/>
-    </w:p>
-    <w:p>
-      <w:bookmarkStart w:id="162" w:name="_Toc215589531"/>
-      <w:r>
-        <w:t>A. Capa de Cliente (Frontend - React)</w:t>
-      </w:r>
-      <w:bookmarkEnd w:id="162"/>
     </w:p>
     <w:p>
       <w:r>
@@ -36318,11 +36298,11 @@
       </w:r>
     </w:p>
     <w:p>
-      <w:bookmarkStart w:id="163" w:name="_Toc215589532"/>
+      <w:bookmarkStart w:id="162" w:name="_Toc215589532"/>
       <w:r>
         <w:t>B. Capa de Servidor (Backend - Node.js &amp; Express)</w:t>
       </w:r>
-      <w:bookmarkEnd w:id="163"/>
+      <w:bookmarkEnd w:id="162"/>
     </w:p>
     <w:p>
       <w:r>
@@ -36538,11 +36518,11 @@
       </w:pPr>
     </w:p>
     <w:p>
-      <w:bookmarkStart w:id="164" w:name="_Toc215589533"/>
+      <w:bookmarkStart w:id="163" w:name="_Toc215589533"/>
       <w:r>
         <w:t>C. Capa de Datos (Database - MySQL)</w:t>
       </w:r>
-      <w:bookmarkEnd w:id="164"/>
+      <w:bookmarkEnd w:id="163"/>
     </w:p>
     <w:p>
       <w:r>
@@ -36586,8 +36566,8 @@
       <w:pPr>
         <w:pStyle w:val="Ttulo3"/>
       </w:pPr>
-      <w:bookmarkStart w:id="165" w:name="_Toc215589534"/>
-      <w:bookmarkStart w:id="166" w:name="_Toc228797237"/>
+      <w:bookmarkStart w:id="164" w:name="_Toc215589534"/>
+      <w:bookmarkStart w:id="165" w:name="_Toc228797237"/>
       <w:r>
         <w:t>9.</w:t>
       </w:r>
@@ -36597,8 +36577,8 @@
       <w:r>
         <w:t>.4. Flujo de Información (Cómo se conectan)</w:t>
       </w:r>
+      <w:bookmarkEnd w:id="164"/>
       <w:bookmarkEnd w:id="165"/>
-      <w:bookmarkEnd w:id="166"/>
     </w:p>
     <w:p>
       <w:r>
@@ -36629,8 +36609,8 @@
       <w:pPr>
         <w:pStyle w:val="Ttulo1"/>
       </w:pPr>
-      <w:bookmarkStart w:id="167" w:name="_Toc215589535"/>
-      <w:bookmarkStart w:id="168" w:name="_Toc228797238"/>
+      <w:bookmarkStart w:id="166" w:name="_Toc215589535"/>
+      <w:bookmarkStart w:id="167" w:name="_Toc228797238"/>
       <w:r>
         <w:t xml:space="preserve">10 Plan </w:t>
       </w:r>
@@ -36640,9 +36620,9 @@
       <w:r>
         <w:t xml:space="preserve"> pruebas</w:t>
       </w:r>
-      <w:bookmarkStart w:id="169" w:name="_Toc215589536"/>
+      <w:bookmarkStart w:id="168" w:name="_Toc215589536"/>
+      <w:bookmarkEnd w:id="166"/>
       <w:bookmarkEnd w:id="167"/>
-      <w:bookmarkEnd w:id="168"/>
     </w:p>
     <w:p>
       <w:pPr>
@@ -36652,7 +36632,7 @@
           <w:lang w:eastAsia="es-AR"/>
         </w:rPr>
       </w:pPr>
-      <w:bookmarkStart w:id="170" w:name="_Toc228797239"/>
+      <w:bookmarkStart w:id="169" w:name="_Toc228797239"/>
       <w:r>
         <w:rPr>
           <w:rFonts w:eastAsia="Times New Roman"/>
@@ -36670,8 +36650,8 @@
         </w:rPr>
         <w:t xml:space="preserve"> y Objetivos</w:t>
       </w:r>
+      <w:bookmarkEnd w:id="168"/>
       <w:bookmarkEnd w:id="169"/>
-      <w:bookmarkEnd w:id="170"/>
     </w:p>
     <w:p>
       <w:pPr>
@@ -36694,8 +36674,8 @@
           <w:lang w:eastAsia="es-AR"/>
         </w:rPr>
       </w:pPr>
-      <w:bookmarkStart w:id="171" w:name="_Toc215589537"/>
-      <w:bookmarkStart w:id="172" w:name="_Toc228797240"/>
+      <w:bookmarkStart w:id="170" w:name="_Toc215589537"/>
+      <w:bookmarkStart w:id="171" w:name="_Toc228797240"/>
       <w:r>
         <w:rPr>
           <w:rFonts w:eastAsia="Times New Roman"/>
@@ -36713,8 +36693,8 @@
         </w:rPr>
         <w:t xml:space="preserve"> (Scope)</w:t>
       </w:r>
+      <w:bookmarkEnd w:id="170"/>
       <w:bookmarkEnd w:id="171"/>
-      <w:bookmarkEnd w:id="172"/>
     </w:p>
     <w:p>
       <w:pPr>
@@ -36900,8 +36880,8 @@
           <w:lang w:eastAsia="es-AR"/>
         </w:rPr>
       </w:pPr>
-      <w:bookmarkStart w:id="173" w:name="_Toc215589538"/>
-      <w:bookmarkStart w:id="174" w:name="_Toc228797241"/>
+      <w:bookmarkStart w:id="172" w:name="_Toc215589538"/>
+      <w:bookmarkStart w:id="173" w:name="_Toc228797241"/>
       <w:r>
         <w:rPr>
           <w:rFonts w:eastAsia="Times New Roman"/>
@@ -36913,8 +36893,8 @@
       <w:r>
         <w:t>Pruebas</w:t>
       </w:r>
+      <w:bookmarkEnd w:id="172"/>
       <w:bookmarkEnd w:id="173"/>
-      <w:bookmarkEnd w:id="174"/>
     </w:p>
     <w:p>
       <w:pPr>
@@ -37045,8 +37025,8 @@
       <w:pPr>
         <w:pStyle w:val="Ttulo2"/>
       </w:pPr>
-      <w:bookmarkStart w:id="175" w:name="_Toc215589539"/>
-      <w:bookmarkStart w:id="176" w:name="_Toc228797242"/>
+      <w:bookmarkStart w:id="174" w:name="_Toc215589539"/>
+      <w:bookmarkStart w:id="175" w:name="_Toc228797242"/>
       <w:r>
         <w:rPr>
           <w:rFonts w:eastAsia="Times New Roman"/>
@@ -37054,8 +37034,8 @@
         </w:rPr>
         <w:t>10.4 Estrategia y Herramientas</w:t>
       </w:r>
+      <w:bookmarkEnd w:id="174"/>
       <w:bookmarkEnd w:id="175"/>
-      <w:bookmarkEnd w:id="176"/>
     </w:p>
     <w:p>
       <w:pPr>
@@ -37148,8 +37128,8 @@
       <w:pPr>
         <w:pStyle w:val="Ttulo2"/>
       </w:pPr>
-      <w:bookmarkStart w:id="177" w:name="_Toc215589540"/>
-      <w:bookmarkStart w:id="178" w:name="_Toc228797243"/>
+      <w:bookmarkStart w:id="176" w:name="_Toc215589540"/>
+      <w:bookmarkStart w:id="177" w:name="_Toc228797243"/>
       <w:r>
         <w:rPr>
           <w:rFonts w:eastAsia="Times New Roman"/>
@@ -37157,8 +37137,8 @@
         </w:rPr>
         <w:t>10.5 Casos de Prueba (Muestra Representativa)</w:t>
       </w:r>
+      <w:bookmarkEnd w:id="176"/>
       <w:bookmarkEnd w:id="177"/>
-      <w:bookmarkEnd w:id="178"/>
     </w:p>
     <w:p>
       <w:pPr>
@@ -37833,7 +37813,7 @@
       <w:pPr>
         <w:pStyle w:val="Ttulo1"/>
       </w:pPr>
-      <w:bookmarkStart w:id="179" w:name="_Toc228797244"/>
+      <w:bookmarkStart w:id="178" w:name="_Toc228797244"/>
       <w:r>
         <w:lastRenderedPageBreak/>
         <w:t>11</w:t>
@@ -37841,20 +37821,20 @@
       <w:r>
         <w:t xml:space="preserve"> RESULTADOS ESPERADOS</w:t>
       </w:r>
+      <w:bookmarkEnd w:id="178"/>
+    </w:p>
+    <w:p>
+      <w:pPr>
+        <w:pStyle w:val="Ttulo2"/>
+      </w:pPr>
+      <w:bookmarkStart w:id="179" w:name="_Toc228797245"/>
+      <w:r>
+        <w:t>11</w:t>
+      </w:r>
+      <w:r>
+        <w:t>.1 Resultados y Beneficios</w:t>
+      </w:r>
       <w:bookmarkEnd w:id="179"/>
-    </w:p>
-    <w:p>
-      <w:pPr>
-        <w:pStyle w:val="Ttulo2"/>
-      </w:pPr>
-      <w:bookmarkStart w:id="180" w:name="_Toc228797245"/>
-      <w:r>
-        <w:t>11</w:t>
-      </w:r>
-      <w:r>
-        <w:t>.1 Resultados y Beneficios</w:t>
-      </w:r>
-      <w:bookmarkEnd w:id="180"/>
     </w:p>
     <w:p>
       <w:r>
@@ -37911,14 +37891,14 @@
       <w:pPr>
         <w:pStyle w:val="Ttulo2"/>
       </w:pPr>
-      <w:bookmarkStart w:id="181" w:name="_Toc228797246"/>
+      <w:bookmarkStart w:id="180" w:name="_Toc228797246"/>
       <w:r>
         <w:t>11</w:t>
       </w:r>
       <w:r>
         <w:t>.2 Resultados Técnicos Alcanzados</w:t>
       </w:r>
-      <w:bookmarkEnd w:id="181"/>
+      <w:bookmarkEnd w:id="180"/>
     </w:p>
     <w:p>
       <w:r>
@@ -38043,14 +38023,14 @@
       <w:pPr>
         <w:pStyle w:val="Ttulo2"/>
       </w:pPr>
-      <w:bookmarkStart w:id="182" w:name="_Toc228797247"/>
+      <w:bookmarkStart w:id="181" w:name="_Toc228797247"/>
       <w:r>
         <w:t>11</w:t>
       </w:r>
       <w:r>
         <w:t>.3 Impacto Académico</w:t>
       </w:r>
-      <w:bookmarkEnd w:id="182"/>
+      <w:bookmarkEnd w:id="181"/>
     </w:p>
     <w:p>
       <w:pPr>
@@ -38150,14 +38130,14 @@
       <w:pPr>
         <w:pStyle w:val="Ttulo2"/>
       </w:pPr>
-      <w:bookmarkStart w:id="183" w:name="_Toc228797248"/>
+      <w:bookmarkStart w:id="182" w:name="_Toc228797248"/>
       <w:r>
         <w:t>11</w:t>
       </w:r>
       <w:r>
         <w:t>.4 Impacto Institucional y Profesional</w:t>
       </w:r>
-      <w:bookmarkEnd w:id="183"/>
+      <w:bookmarkEnd w:id="182"/>
     </w:p>
     <w:p>
       <w:pPr>
@@ -38225,7 +38205,7 @@
       <w:pPr>
         <w:pStyle w:val="Ttulo1"/>
       </w:pPr>
-      <w:bookmarkStart w:id="184" w:name="_Toc228797249"/>
+      <w:bookmarkStart w:id="183" w:name="_Toc228797249"/>
       <w:r>
         <w:lastRenderedPageBreak/>
         <w:t>12</w:t>
@@ -38233,7 +38213,7 @@
       <w:r>
         <w:t xml:space="preserve"> REFERENCIAS</w:t>
       </w:r>
-      <w:bookmarkEnd w:id="184"/>
+      <w:bookmarkEnd w:id="183"/>
     </w:p>
     <w:p>
       <w:pPr>
@@ -38314,13 +38294,13 @@
         <w:rPr>
           <w:b/>
           <w:bCs/>
-          <w:lang w:val="es-ES" w:eastAsia="es-ES"/>
+          <w:lang w:val="en-US" w:eastAsia="es-ES"/>
         </w:rPr>
         <w:t>GitHub.</w:t>
       </w:r>
       <w:r>
         <w:rPr>
-          <w:lang w:val="es-ES" w:eastAsia="es-ES"/>
+          <w:lang w:val="en-US" w:eastAsia="es-ES"/>
         </w:rPr>
         <w:t xml:space="preserve"> (s.f.). </w:t>
       </w:r>
@@ -38328,15 +38308,21 @@
         <w:rPr>
           <w:i/>
           <w:iCs/>
+          <w:lang w:val="en-US" w:eastAsia="es-ES"/>
+        </w:rPr>
+        <w:t>GitHub Documentation</w:t>
+      </w:r>
+      <w:r>
+        <w:rPr>
+          <w:lang w:val="en-US" w:eastAsia="es-ES"/>
+        </w:rPr>
+        <w:t xml:space="preserve">. </w:t>
+      </w:r>
+      <w:r>
+        <w:rPr>
           <w:lang w:val="es-ES" w:eastAsia="es-ES"/>
         </w:rPr>
-        <w:t>GitHub Documentation</w:t>
-      </w:r>
-      <w:r>
-        <w:rPr>
-          <w:lang w:val="es-ES" w:eastAsia="es-ES"/>
-        </w:rPr>
-        <w:t xml:space="preserve">. Recuperado el 28 de abril de 2026, de </w:t>
+        <w:t xml:space="preserve">Recuperado el 28 de abril de 2026, de </w:t>
       </w:r>
       <w:hyperlink r:id="rId20" w:tgtFrame="_blank" w:history="1">
         <w:r>
@@ -38365,7 +38351,7 @@
           <w:numId w:val="53"/>
         </w:numPr>
         <w:rPr>
-          <w:lang w:val="es-ES" w:eastAsia="es-ES"/>
+          <w:lang w:val="en-US" w:eastAsia="es-ES"/>
         </w:rPr>
       </w:pPr>
       <w:r>
@@ -38386,13 +38372,13 @@
         <w:rPr>
           <w:i/>
           <w:iCs/>
-          <w:lang w:val="es-ES" w:eastAsia="es-ES"/>
+          <w:lang w:val="en-US" w:eastAsia="es-ES"/>
         </w:rPr>
         <w:t>JSON Web Token (JWT)</w:t>
       </w:r>
       <w:r>
         <w:rPr>
-          <w:lang w:val="es-ES" w:eastAsia="es-ES"/>
+          <w:lang w:val="en-US" w:eastAsia="es-ES"/>
         </w:rPr>
         <w:t xml:space="preserve"> (RFC 7519). Internet Engineering Task Force (IETF). </w:t>
       </w:r>
@@ -38401,14 +38387,14 @@
           <w:rPr>
             <w:color w:val="0000FF"/>
             <w:u w:val="single"/>
-            <w:lang w:val="es-ES" w:eastAsia="es-ES"/>
+            <w:lang w:val="en-US" w:eastAsia="es-ES"/>
           </w:rPr>
           <w:t>https://datatracker.ietf.org/doc/html/rfc7519</w:t>
         </w:r>
       </w:hyperlink>
       <w:r>
         <w:rPr>
-          <w:lang w:val="es-ES" w:eastAsia="es-ES"/>
+          <w:lang w:val="en-US" w:eastAsia="es-ES"/>
         </w:rPr>
         <w:t xml:space="preserve"> </w:t>
       </w:r>
@@ -38417,7 +38403,7 @@
       <w:pPr>
         <w:pStyle w:val="Prrafodelista"/>
         <w:rPr>
-          <w:lang w:val="es-ES" w:eastAsia="es-ES"/>
+          <w:lang w:val="en-US" w:eastAsia="es-ES"/>
         </w:rPr>
       </w:pPr>
     </w:p>
@@ -38425,7 +38411,7 @@
       <w:pPr>
         <w:pStyle w:val="Prrafodelista"/>
         <w:rPr>
-          <w:lang w:val="es-ES" w:eastAsia="es-ES"/>
+          <w:lang w:val="en-US" w:eastAsia="es-ES"/>
         </w:rPr>
       </w:pPr>
     </w:p>
@@ -38580,13 +38566,13 @@
         <w:rPr>
           <w:b/>
           <w:bCs/>
-          <w:lang w:val="es-ES" w:eastAsia="es-ES"/>
+          <w:lang w:val="en-US" w:eastAsia="es-ES"/>
         </w:rPr>
         <w:t>Oracle Corporation.</w:t>
       </w:r>
       <w:r>
         <w:rPr>
-          <w:lang w:val="es-ES" w:eastAsia="es-ES"/>
+          <w:lang w:val="en-US" w:eastAsia="es-ES"/>
         </w:rPr>
         <w:t xml:space="preserve"> (s.f.). </w:t>
       </w:r>
@@ -38594,15 +38580,21 @@
         <w:rPr>
           <w:i/>
           <w:iCs/>
+          <w:lang w:val="en-US" w:eastAsia="es-ES"/>
+        </w:rPr>
+        <w:t>MySQL 8.0 Reference Manual</w:t>
+      </w:r>
+      <w:r>
+        <w:rPr>
+          <w:lang w:val="en-US" w:eastAsia="es-ES"/>
+        </w:rPr>
+        <w:t xml:space="preserve">. </w:t>
+      </w:r>
+      <w:r>
+        <w:rPr>
           <w:lang w:val="es-ES" w:eastAsia="es-ES"/>
         </w:rPr>
-        <w:t>MySQL 8.0 Reference Manual</w:t>
-      </w:r>
-      <w:r>
-        <w:rPr>
-          <w:lang w:val="es-ES" w:eastAsia="es-ES"/>
-        </w:rPr>
-        <w:t xml:space="preserve">. Recuperado el 28 de abril de 2026, de </w:t>
+        <w:t xml:space="preserve">Recuperado el 28 de abril de 2026, de </w:t>
       </w:r>
       <w:hyperlink r:id="rId24" w:tgtFrame="_blank" w:history="1">
         <w:r>
@@ -38644,13 +38636,13 @@
         <w:rPr>
           <w:b/>
           <w:bCs/>
-          <w:lang w:val="es-ES" w:eastAsia="es-ES"/>
+          <w:lang w:val="en-US" w:eastAsia="es-ES"/>
         </w:rPr>
         <w:t>Postman.</w:t>
       </w:r>
       <w:r>
         <w:rPr>
-          <w:lang w:val="es-ES" w:eastAsia="es-ES"/>
+          <w:lang w:val="en-US" w:eastAsia="es-ES"/>
         </w:rPr>
         <w:t xml:space="preserve"> (s.f.). </w:t>
       </w:r>
@@ -38658,15 +38650,21 @@
         <w:rPr>
           <w:i/>
           <w:iCs/>
+          <w:lang w:val="en-US" w:eastAsia="es-ES"/>
+        </w:rPr>
+        <w:t>Postman API Platform</w:t>
+      </w:r>
+      <w:r>
+        <w:rPr>
+          <w:lang w:val="en-US" w:eastAsia="es-ES"/>
+        </w:rPr>
+        <w:t xml:space="preserve">. </w:t>
+      </w:r>
+      <w:r>
+        <w:rPr>
           <w:lang w:val="es-ES" w:eastAsia="es-ES"/>
         </w:rPr>
-        <w:t>Postman API Platform</w:t>
-      </w:r>
-      <w:r>
-        <w:rPr>
-          <w:lang w:val="es-ES" w:eastAsia="es-ES"/>
-        </w:rPr>
-        <w:t xml:space="preserve">. Recuperado el 28 de abril de 2026, de </w:t>
+        <w:t xml:space="preserve">Recuperado el 28 de abril de 2026, de </w:t>
       </w:r>
       <w:hyperlink r:id="rId25" w:tgtFrame="_blank" w:history="1">
         <w:r>
@@ -38709,7 +38707,7 @@
           <w:numId w:val="53"/>
         </w:numPr>
         <w:rPr>
-          <w:lang w:val="es-ES" w:eastAsia="es-ES"/>
+          <w:lang w:val="en-US" w:eastAsia="es-ES"/>
         </w:rPr>
       </w:pPr>
       <w:r>
@@ -38738,21 +38736,27 @@
         <w:rPr>
           <w:lang w:val="es-ES" w:eastAsia="es-ES"/>
         </w:rPr>
-        <w:t xml:space="preserve">. Scrum.org. </w:t>
+        <w:t xml:space="preserve">. </w:t>
+      </w:r>
+      <w:r>
+        <w:rPr>
+          <w:lang w:val="en-US" w:eastAsia="es-ES"/>
+        </w:rPr>
+        <w:t xml:space="preserve">Scrum.org. </w:t>
       </w:r>
       <w:hyperlink r:id="rId26" w:tgtFrame="_blank" w:history="1">
         <w:r>
           <w:rPr>
             <w:color w:val="0000FF"/>
             <w:u w:val="single"/>
-            <w:lang w:val="es-ES" w:eastAsia="es-ES"/>
+            <w:lang w:val="en-US" w:eastAsia="es-ES"/>
           </w:rPr>
           <w:t>https://scrumguides.org/docs/scrumguide/v2020/2020-Scrum-Guide-Spanish-Latin-South-American.pdf</w:t>
         </w:r>
       </w:hyperlink>
       <w:r>
         <w:rPr>
-          <w:lang w:val="es-ES" w:eastAsia="es-ES"/>
+          <w:lang w:val="en-US" w:eastAsia="es-ES"/>
         </w:rPr>
         <w:t xml:space="preserve"> </w:t>
       </w:r>
@@ -38761,7 +38765,7 @@
       <w:pPr>
         <w:pStyle w:val="Prrafodelista"/>
         <w:rPr>
-          <w:lang w:val="es-ES" w:eastAsia="es-ES"/>
+          <w:lang w:val="en-US" w:eastAsia="es-ES"/>
         </w:rPr>
       </w:pPr>
     </w:p>
@@ -38780,13 +38784,13 @@
         <w:rPr>
           <w:b/>
           <w:bCs/>
-          <w:lang w:val="es-ES" w:eastAsia="es-ES"/>
+          <w:lang w:val="en-US" w:eastAsia="es-ES"/>
         </w:rPr>
         <w:t>Tailwind Labs.</w:t>
       </w:r>
       <w:r>
         <w:rPr>
-          <w:lang w:val="es-ES" w:eastAsia="es-ES"/>
+          <w:lang w:val="en-US" w:eastAsia="es-ES"/>
         </w:rPr>
         <w:t xml:space="preserve"> (s.f.). </w:t>
       </w:r>
@@ -38794,15 +38798,21 @@
         <w:rPr>
           <w:i/>
           <w:iCs/>
+          <w:lang w:val="en-US" w:eastAsia="es-ES"/>
+        </w:rPr>
+        <w:t>Tailwind CSS Documentation</w:t>
+      </w:r>
+      <w:r>
+        <w:rPr>
+          <w:lang w:val="en-US" w:eastAsia="es-ES"/>
+        </w:rPr>
+        <w:t xml:space="preserve">. </w:t>
+      </w:r>
+      <w:r>
+        <w:rPr>
           <w:lang w:val="es-ES" w:eastAsia="es-ES"/>
         </w:rPr>
-        <w:t>Tailwind CSS Documentation</w:t>
-      </w:r>
-      <w:r>
-        <w:rPr>
-          <w:lang w:val="es-ES" w:eastAsia="es-ES"/>
-        </w:rPr>
-        <w:t xml:space="preserve">. Recuperado el 28 de abril de 2026, de </w:t>
+        <w:t xml:space="preserve">Recuperado el 28 de abril de 2026, de </w:t>
       </w:r>
       <w:hyperlink r:id="rId27" w:tgtFrame="_blank" w:history="1">
         <w:r>
@@ -38845,7 +38855,7 @@
 </file>
 
 <file path=word/endnotes.xml><?xml version="1.0" encoding="utf-8"?>
-<w:endnotes xmlns:wpc="http://schemas.microsoft.com/office/word/2010/wordprocessingCanvas" xmlns:cx="http://schemas.microsoft.com/office/drawing/2014/chartex" xmlns:mc="http://schemas.openxmlformats.org/markup-compatibility/2006" xmlns:o="urn:schemas-microsoft-com:office:office" xmlns:r="http://schemas.openxmlformats.org/officeDocument/2006/relationships" xmlns:m="http://schemas.openxmlformats.org/officeDocument/2006/math" xmlns:v="urn:schemas-microsoft-com:vml" xmlns:wp14="http://schemas.microsoft.com/office/word/2010/wordprocessingDrawing" xmlns:wp="http://schemas.openxmlformats.org/drawingml/2006/wordprocessingDrawing" xmlns:w10="urn:schemas-microsoft-com:office:word" xmlns:w="http://schemas.openxmlformats.org/wordprocessingml/2006/main" xmlns:w14="http://schemas.microsoft.com/office/word/2010/wordml" xmlns:w15="http://schemas.microsoft.com/office/word/2012/wordml" xmlns:w16se="http://schemas.microsoft.com/office/word/2015/wordml/symex" xmlns:wpg="http://schemas.microsoft.com/office/word/2010/wordprocessingGroup" xmlns:wpi="http://schemas.microsoft.com/office/word/2010/wordprocessingInk" xmlns:wne="http://schemas.microsoft.com/office/word/2006/wordml" xmlns:wps="http://schemas.microsoft.com/office/word/2010/wordprocessingShape" mc:Ignorable="w14 w15 w16se wp14">
+<w:endnotes xmlns:wpc="http://schemas.microsoft.com/office/word/2010/wordprocessingCanvas" xmlns:cx="http://schemas.microsoft.com/office/drawing/2014/chartex" xmlns:cx1="http://schemas.microsoft.com/office/drawing/2015/9/8/chartex" xmlns:cx2="http://schemas.microsoft.com/office/drawing/2015/10/21/chartex" xmlns:cx3="http://schemas.microsoft.com/office/drawing/2016/5/9/chartex" xmlns:cx4="http://schemas.microsoft.com/office/drawing/2016/5/10/chartex" xmlns:cx5="http://schemas.microsoft.com/office/drawing/2016/5/11/chartex" xmlns:cx6="http://schemas.microsoft.com/office/drawing/2016/5/12/chartex" xmlns:cx7="http://schemas.microsoft.com/office/drawing/2016/5/13/chartex" xmlns:cx8="http://schemas.microsoft.com/office/drawing/2016/5/14/chartex" xmlns:mc="http://schemas.openxmlformats.org/markup-compatibility/2006" xmlns:aink="http://schemas.microsoft.com/office/drawing/2016/ink" xmlns:am3d="http://schemas.microsoft.com/office/drawing/2017/model3d" xmlns:o="urn:schemas-microsoft-com:office:office" xmlns:r="http://schemas.openxmlformats.org/officeDocument/2006/relationships" xmlns:m="http://schemas.openxmlformats.org/officeDocument/2006/math" xmlns:v="urn:schemas-microsoft-com:vml" xmlns:wp14="http://schemas.microsoft.com/office/word/2010/wordprocessingDrawing" xmlns:wp="http://schemas.openxmlformats.org/drawingml/2006/wordprocessingDrawing" xmlns:w10="urn:schemas-microsoft-com:office:word" xmlns:w="http://schemas.openxmlformats.org/wordprocessingml/2006/main" xmlns:w14="http://schemas.microsoft.com/office/word/2010/wordml" xmlns:w15="http://schemas.microsoft.com/office/word/2012/wordml" xmlns:w16cex="http://schemas.microsoft.com/office/word/2018/wordml/cex" xmlns:w16cid="http://schemas.microsoft.com/office/word/2016/wordml/cid" xmlns:w16="http://schemas.microsoft.com/office/word/2018/wordml" xmlns:w16sdtdh="http://schemas.microsoft.com/office/word/2020/wordml/sdtdatahash" xmlns:w16se="http://schemas.microsoft.com/office/word/2015/wordml/symex" xmlns:wpg="http://schemas.microsoft.com/office/word/2010/wordprocessingGroup" xmlns:wpi="http://schemas.microsoft.com/office/word/2010/wordprocessingInk" xmlns:wne="http://schemas.microsoft.com/office/word/2006/wordml" xmlns:wps="http://schemas.microsoft.com/office/word/2010/wordprocessingShape" mc:Ignorable="w14 w15 w16se w16cid w16 w16cex w16sdtdh wp14">
   <w:endnote w:type="separator" w:id="-1">
     <w:p>
       <w:pPr>
@@ -38870,7 +38880,7 @@
 </file>
 
 <file path=word/footer1.xml><?xml version="1.0" encoding="utf-8"?>
-<w:ftr xmlns:wpc="http://schemas.microsoft.com/office/word/2010/wordprocessingCanvas" xmlns:cx="http://schemas.microsoft.com/office/drawing/2014/chartex" xmlns:mc="http://schemas.openxmlformats.org/markup-compatibility/2006" xmlns:o="urn:schemas-microsoft-com:office:office" xmlns:r="http://schemas.openxmlformats.org/officeDocument/2006/relationships" xmlns:m="http://schemas.openxmlformats.org/officeDocument/2006/math" xmlns:v="urn:schemas-microsoft-com:vml" xmlns:wp14="http://schemas.microsoft.com/office/word/2010/wordprocessingDrawing" xmlns:wp="http://schemas.openxmlformats.org/drawingml/2006/wordprocessingDrawing" xmlns:w10="urn:schemas-microsoft-com:office:word" xmlns:w="http://schemas.openxmlformats.org/wordprocessingml/2006/main" xmlns:w14="http://schemas.microsoft.com/office/word/2010/wordml" xmlns:w15="http://schemas.microsoft.com/office/word/2012/wordml" xmlns:w16se="http://schemas.microsoft.com/office/word/2015/wordml/symex" xmlns:wpg="http://schemas.microsoft.com/office/word/2010/wordprocessingGroup" xmlns:wpi="http://schemas.microsoft.com/office/word/2010/wordprocessingInk" xmlns:wne="http://schemas.microsoft.com/office/word/2006/wordml" xmlns:wps="http://schemas.microsoft.com/office/word/2010/wordprocessingShape" mc:Ignorable="w14 w15 w16se wp14">
+<w:ftr xmlns:wpc="http://schemas.microsoft.com/office/word/2010/wordprocessingCanvas" xmlns:cx="http://schemas.microsoft.com/office/drawing/2014/chartex" xmlns:cx1="http://schemas.microsoft.com/office/drawing/2015/9/8/chartex" xmlns:cx2="http://schemas.microsoft.com/office/drawing/2015/10/21/chartex" xmlns:cx3="http://schemas.microsoft.com/office/drawing/2016/5/9/chartex" xmlns:cx4="http://schemas.microsoft.com/office/drawing/2016/5/10/chartex" xmlns:cx5="http://schemas.microsoft.com/office/drawing/2016/5/11/chartex" xmlns:cx6="http://schemas.microsoft.com/office/drawing/2016/5/12/chartex" xmlns:cx7="http://schemas.microsoft.com/office/drawing/2016/5/13/chartex" xmlns:cx8="http://schemas.microsoft.com/office/drawing/2016/5/14/chartex" xmlns:mc="http://schemas.openxmlformats.org/markup-compatibility/2006" xmlns:aink="http://schemas.microsoft.com/office/drawing/2016/ink" xmlns:am3d="http://schemas.microsoft.com/office/drawing/2017/model3d" xmlns:o="urn:schemas-microsoft-com:office:office" xmlns:r="http://schemas.openxmlformats.org/officeDocument/2006/relationships" xmlns:m="http://schemas.openxmlformats.org/officeDocument/2006/math" xmlns:v="urn:schemas-microsoft-com:vml" xmlns:wp14="http://schemas.microsoft.com/office/word/2010/wordprocessingDrawing" xmlns:wp="http://schemas.openxmlformats.org/drawingml/2006/wordprocessingDrawing" xmlns:w10="urn:schemas-microsoft-com:office:word" xmlns:w="http://schemas.openxmlformats.org/wordprocessingml/2006/main" xmlns:w14="http://schemas.microsoft.com/office/word/2010/wordml" xmlns:w15="http://schemas.microsoft.com/office/word/2012/wordml" xmlns:w16cex="http://schemas.microsoft.com/office/word/2018/wordml/cex" xmlns:w16cid="http://schemas.microsoft.com/office/word/2016/wordml/cid" xmlns:w16="http://schemas.microsoft.com/office/word/2018/wordml" xmlns:w16sdtdh="http://schemas.microsoft.com/office/word/2020/wordml/sdtdatahash" xmlns:w16se="http://schemas.microsoft.com/office/word/2015/wordml/symex" xmlns:wpg="http://schemas.microsoft.com/office/word/2010/wordprocessingGroup" xmlns:wpi="http://schemas.microsoft.com/office/word/2010/wordprocessingInk" xmlns:wne="http://schemas.microsoft.com/office/word/2006/wordml" xmlns:wps="http://schemas.microsoft.com/office/word/2010/wordprocessingShape" mc:Ignorable="w14 w15 w16se w16cid w16 w16cex w16sdtdh wp14">
   <w:p>
     <w:pPr>
       <w:pStyle w:val="Piedepgina"/>
@@ -38885,7 +38895,7 @@
       <mc:AlternateContent>
         <mc:Choice Requires="wpg">
           <w:drawing>
-            <wp:anchor distT="0" distB="0" distL="0" distR="0" simplePos="0" relativeHeight="251660288" behindDoc="0" locked="0" layoutInCell="1" allowOverlap="1" wp14:anchorId="15FFF0EC" wp14:editId="16CA57FE">
+            <wp:anchor distT="0" distB="0" distL="0" distR="0" simplePos="0" relativeHeight="251660288" behindDoc="0" locked="0" layoutInCell="1" allowOverlap="1" wp14:anchorId="7ABA8335" wp14:editId="60487D37">
               <wp:simplePos x="0" y="0"/>
               <wp:positionH relativeFrom="margin">
                 <wp:align>right</wp:align>
@@ -39030,7 +39040,7 @@
         </mc:Choice>
         <mc:Fallback>
           <w:pict>
-            <v:group w14:anchorId="15FFF0EC" id="Grupo 37" o:spid="_x0000_s1028" style="position:absolute;margin-left:416.8pt;margin-top:0;width:468pt;height:25.2pt;z-index:251660288;mso-width-percent:1000;mso-top-percent:200;mso-wrap-distance-left:0;mso-wrap-distance-right:0;mso-position-horizontal:right;mso-position-horizontal-relative:margin;mso-position-vertical-relative:bottom-margin-area;mso-width-percent:1000;mso-top-percent:200;mso-width-relative:margin;mso-height-relative:margin" coordsize="59626,3238" o:gfxdata="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">
+            <v:group w14:anchorId="7ABA8335" id="Grupo 37" o:spid="_x0000_s1028" style="position:absolute;margin-left:416.8pt;margin-top:0;width:468pt;height:25.2pt;z-index:251660288;mso-width-percent:1000;mso-top-percent:200;mso-wrap-distance-left:0;mso-wrap-distance-right:0;mso-position-horizontal:right;mso-position-horizontal-relative:margin;mso-position-vertical-relative:bottom-margin-area;mso-width-percent:1000;mso-top-percent:200;mso-width-relative:margin;mso-height-relative:margin" coordsize="59626,3238" o:gfxdata="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">
               <v:rect id="Rectángulo 38" o:spid="_x0000_s1029" style="position:absolute;left:190;width:59436;height:188;visibility:visible;mso-wrap-style:square;v-text-anchor:middle" o:gfxdata="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" filled="f" strokecolor="white [3201]" strokeweight="1.5pt"/>
               <v:shapetype id="_x0000_t202" coordsize="21600,21600" o:spt="202" path="m,l,21600r21600,l21600,xe">
                 <v:stroke joinstyle="miter"/>
@@ -39080,7 +39090,7 @@
       <mc:AlternateContent>
         <mc:Choice Requires="wps">
           <w:drawing>
-            <wp:anchor distT="0" distB="0" distL="0" distR="0" simplePos="0" relativeHeight="251659264" behindDoc="0" locked="0" layoutInCell="1" allowOverlap="1" wp14:anchorId="0CE560FB" wp14:editId="56C63C92">
+            <wp:anchor distT="0" distB="0" distL="0" distR="0" simplePos="0" relativeHeight="251659264" behindDoc="0" locked="0" layoutInCell="1" allowOverlap="1" wp14:anchorId="57F895A6" wp14:editId="7691E601">
               <wp:simplePos x="0" y="0"/>
               <wp:positionH relativeFrom="rightMargin">
                 <wp:align>left</wp:align>
@@ -39214,7 +39224,7 @@
         </mc:Choice>
         <mc:Fallback>
           <w:pict>
-            <v:rect w14:anchorId="0CE560FB" id="Rectángulo 40" o:spid="_x0000_s1031" style="position:absolute;margin-left:0;margin-top:0;width:36pt;height:25.2pt;z-index:251659264;visibility:visible;mso-wrap-style:square;mso-width-percent:0;mso-height-percent:0;mso-top-percent:200;mso-wrap-distance-left:0;mso-wrap-distance-top:0;mso-wrap-distance-right:0;mso-wrap-distance-bottom:0;mso-position-horizontal:left;mso-position-horizontal-relative:right-margin-area;mso-position-vertical-relative:bottom-margin-area;mso-width-percent:0;mso-height-percent:0;mso-top-percent:200;mso-width-relative:margin;mso-height-relative:margin;v-text-anchor:bottom" o:gfxdata="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" fillcolor="#96f" stroked="f" strokeweight="3pt">
+            <v:rect w14:anchorId="57F895A6" id="Rectángulo 40" o:spid="_x0000_s1031" style="position:absolute;margin-left:0;margin-top:0;width:36pt;height:25.2pt;z-index:251659264;visibility:visible;mso-wrap-style:square;mso-width-percent:0;mso-height-percent:0;mso-top-percent:200;mso-wrap-distance-left:0;mso-wrap-distance-top:0;mso-wrap-distance-right:0;mso-wrap-distance-bottom:0;mso-position-horizontal:left;mso-position-horizontal-relative:right-margin-area;mso-position-vertical-relative:bottom-margin-area;mso-width-percent:0;mso-height-percent:0;mso-top-percent:200;mso-width-relative:margin;mso-height-relative:margin;v-text-anchor:bottom" o:gfxdata="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" fillcolor="#96f" stroked="f" strokeweight="3pt">
               <v:textbox>
                 <w:txbxContent>
                   <w:p>
@@ -39283,7 +39293,7 @@
 </file>
 
 <file path=word/footnotes.xml><?xml version="1.0" encoding="utf-8"?>
-<w:footnotes xmlns:wpc="http://schemas.microsoft.com/office/word/2010/wordprocessingCanvas" xmlns:cx="http://schemas.microsoft.com/office/drawing/2014/chartex" xmlns:mc="http://schemas.openxmlformats.org/markup-compatibility/2006" xmlns:o="urn:schemas-microsoft-com:office:office" xmlns:r="http://schemas.openxmlformats.org/officeDocument/2006/relationships" xmlns:m="http://schemas.openxmlformats.org/officeDocument/2006/math" xmlns:v="urn:schemas-microsoft-com:vml" xmlns:wp14="http://schemas.microsoft.com/office/word/2010/wordprocessingDrawing" xmlns:wp="http://schemas.openxmlformats.org/drawingml/2006/wordprocessingDrawing" xmlns:w10="urn:schemas-microsoft-com:office:word" xmlns:w="http://schemas.openxmlformats.org/wordprocessingml/2006/main" xmlns:w14="http://schemas.microsoft.com/office/word/2010/wordml" xmlns:w15="http://schemas.microsoft.com/office/word/2012/wordml" xmlns:w16se="http://schemas.microsoft.com/office/word/2015/wordml/symex" xmlns:wpg="http://schemas.microsoft.com/office/word/2010/wordprocessingGroup" xmlns:wpi="http://schemas.microsoft.com/office/word/2010/wordprocessingInk" xmlns:wne="http://schemas.microsoft.com/office/word/2006/wordml" xmlns:wps="http://schemas.microsoft.com/office/word/2010/wordprocessingShape" mc:Ignorable="w14 w15 w16se wp14">
+<w:footnotes xmlns:wpc="http://schemas.microsoft.com/office/word/2010/wordprocessingCanvas" xmlns:cx="http://schemas.microsoft.com/office/drawing/2014/chartex" xmlns:cx1="http://schemas.microsoft.com/office/drawing/2015/9/8/chartex" xmlns:cx2="http://schemas.microsoft.com/office/drawing/2015/10/21/chartex" xmlns:cx3="http://schemas.microsoft.com/office/drawing/2016/5/9/chartex" xmlns:cx4="http://schemas.microsoft.com/office/drawing/2016/5/10/chartex" xmlns:cx5="http://schemas.microsoft.com/office/drawing/2016/5/11/chartex" xmlns:cx6="http://schemas.microsoft.com/office/drawing/2016/5/12/chartex" xmlns:cx7="http://schemas.microsoft.com/office/drawing/2016/5/13/chartex" xmlns:cx8="http://schemas.microsoft.com/office/drawing/2016/5/14/chartex" xmlns:mc="http://schemas.openxmlformats.org/markup-compatibility/2006" xmlns:aink="http://schemas.microsoft.com/office/drawing/2016/ink" xmlns:am3d="http://schemas.microsoft.com/office/drawing/2017/model3d" xmlns:o="urn:schemas-microsoft-com:office:office" xmlns:r="http://schemas.openxmlformats.org/officeDocument/2006/relationships" xmlns:m="http://schemas.openxmlformats.org/officeDocument/2006/math" xmlns:v="urn:schemas-microsoft-com:vml" xmlns:wp14="http://schemas.microsoft.com/office/word/2010/wordprocessingDrawing" xmlns:wp="http://schemas.openxmlformats.org/drawingml/2006/wordprocessingDrawing" xmlns:w10="urn:schemas-microsoft-com:office:word" xmlns:w="http://schemas.openxmlformats.org/wordprocessingml/2006/main" xmlns:w14="http://schemas.microsoft.com/office/word/2010/wordml" xmlns:w15="http://schemas.microsoft.com/office/word/2012/wordml" xmlns:w16cex="http://schemas.microsoft.com/office/word/2018/wordml/cex" xmlns:w16cid="http://schemas.microsoft.com/office/word/2016/wordml/cid" xmlns:w16="http://schemas.microsoft.com/office/word/2018/wordml" xmlns:w16sdtdh="http://schemas.microsoft.com/office/word/2020/wordml/sdtdatahash" xmlns:w16se="http://schemas.microsoft.com/office/word/2015/wordml/symex" xmlns:wpg="http://schemas.microsoft.com/office/word/2010/wordprocessingGroup" xmlns:wpi="http://schemas.microsoft.com/office/word/2010/wordprocessingInk" xmlns:wne="http://schemas.microsoft.com/office/word/2006/wordml" xmlns:wps="http://schemas.microsoft.com/office/word/2010/wordprocessingShape" mc:Ignorable="w14 w15 w16se w16cid w16 w16cex w16sdtdh wp14">
   <w:footnote w:type="separator" w:id="-1">
     <w:p>
       <w:pPr>
@@ -39308,7 +39318,7 @@
 </file>
 
 <file path=word/header1.xml><?xml version="1.0" encoding="utf-8"?>
-<w:hdr xmlns:wpc="http://schemas.microsoft.com/office/word/2010/wordprocessingCanvas" xmlns:cx="http://schemas.microsoft.com/office/drawing/2014/chartex" xmlns:mc="http://schemas.openxmlformats.org/markup-compatibility/2006" xmlns:o="urn:schemas-microsoft-com:office:office" xmlns:r="http://schemas.openxmlformats.org/officeDocument/2006/relationships" xmlns:m="http://schemas.openxmlformats.org/officeDocument/2006/math" xmlns:v="urn:schemas-microsoft-com:vml" xmlns:wp14="http://schemas.microsoft.com/office/word/2010/wordprocessingDrawing" xmlns:wp="http://schemas.openxmlformats.org/drawingml/2006/wordprocessingDrawing" xmlns:w10="urn:schemas-microsoft-com:office:word" xmlns:w="http://schemas.openxmlformats.org/wordprocessingml/2006/main" xmlns:w14="http://schemas.microsoft.com/office/word/2010/wordml" xmlns:w15="http://schemas.microsoft.com/office/word/2012/wordml" xmlns:w16se="http://schemas.microsoft.com/office/word/2015/wordml/symex" xmlns:wpg="http://schemas.microsoft.com/office/word/2010/wordprocessingGroup" xmlns:wpi="http://schemas.microsoft.com/office/word/2010/wordprocessingInk" xmlns:wne="http://schemas.microsoft.com/office/word/2006/wordml" xmlns:wps="http://schemas.microsoft.com/office/word/2010/wordprocessingShape" mc:Ignorable="w14 w15 w16se wp14">
+<w:hdr xmlns:wpc="http://schemas.microsoft.com/office/word/2010/wordprocessingCanvas" xmlns:cx="http://schemas.microsoft.com/office/drawing/2014/chartex" xmlns:cx1="http://schemas.microsoft.com/office/drawing/2015/9/8/chartex" xmlns:cx2="http://schemas.microsoft.com/office/drawing/2015/10/21/chartex" xmlns:cx3="http://schemas.microsoft.com/office/drawing/2016/5/9/chartex" xmlns:cx4="http://schemas.microsoft.com/office/drawing/2016/5/10/chartex" xmlns:cx5="http://schemas.microsoft.com/office/drawing/2016/5/11/chartex" xmlns:cx6="http://schemas.microsoft.com/office/drawing/2016/5/12/chartex" xmlns:cx7="http://schemas.microsoft.com/office/drawing/2016/5/13/chartex" xmlns:cx8="http://schemas.microsoft.com/office/drawing/2016/5/14/chartex" xmlns:mc="http://schemas.openxmlformats.org/markup-compatibility/2006" xmlns:aink="http://schemas.microsoft.com/office/drawing/2016/ink" xmlns:am3d="http://schemas.microsoft.com/office/drawing/2017/model3d" xmlns:o="urn:schemas-microsoft-com:office:office" xmlns:r="http://schemas.openxmlformats.org/officeDocument/2006/relationships" xmlns:m="http://schemas.openxmlformats.org/officeDocument/2006/math" xmlns:v="urn:schemas-microsoft-com:vml" xmlns:wp14="http://schemas.microsoft.com/office/word/2010/wordprocessingDrawing" xmlns:wp="http://schemas.openxmlformats.org/drawingml/2006/wordprocessingDrawing" xmlns:w10="urn:schemas-microsoft-com:office:word" xmlns:w="http://schemas.openxmlformats.org/wordprocessingml/2006/main" xmlns:w14="http://schemas.microsoft.com/office/word/2010/wordml" xmlns:w15="http://schemas.microsoft.com/office/word/2012/wordml" xmlns:w16cex="http://schemas.microsoft.com/office/word/2018/wordml/cex" xmlns:w16cid="http://schemas.microsoft.com/office/word/2016/wordml/cid" xmlns:w16="http://schemas.microsoft.com/office/word/2018/wordml" xmlns:w16sdtdh="http://schemas.microsoft.com/office/word/2020/wordml/sdtdatahash" xmlns:w16se="http://schemas.microsoft.com/office/word/2015/wordml/symex" xmlns:wpg="http://schemas.microsoft.com/office/word/2010/wordprocessingGroup" xmlns:wpi="http://schemas.microsoft.com/office/word/2010/wordprocessingInk" xmlns:wne="http://schemas.microsoft.com/office/word/2006/wordml" xmlns:wps="http://schemas.microsoft.com/office/word/2010/wordprocessingShape" mc:Ignorable="w14 w15 w16se w16cid w16 w16cex w16sdtdh wp14">
   <w:p>
     <w:pPr>
       <w:pStyle w:val="Encabezado"/>
@@ -39319,7 +39329,7 @@
         <w:lang w:val="es-ES" w:eastAsia="es-ES"/>
       </w:rPr>
       <w:drawing>
-        <wp:anchor distT="0" distB="0" distL="114300" distR="114300" simplePos="0" relativeHeight="251662336" behindDoc="0" locked="0" layoutInCell="1" allowOverlap="1" wp14:anchorId="7A14DF34" wp14:editId="0DC3C88D">
+        <wp:anchor distT="0" distB="0" distL="114300" distR="114300" simplePos="0" relativeHeight="251662336" behindDoc="0" locked="0" layoutInCell="1" allowOverlap="1" wp14:anchorId="1A483A20" wp14:editId="5FEAA987">
           <wp:simplePos x="0" y="0"/>
           <wp:positionH relativeFrom="column">
             <wp:posOffset>4378656</wp:posOffset>
@@ -39380,7 +39390,7 @@
         <w:lang w:val="es-ES" w:eastAsia="es-ES"/>
       </w:rPr>
       <w:drawing>
-        <wp:anchor distT="0" distB="0" distL="114300" distR="114300" simplePos="0" relativeHeight="251661312" behindDoc="0" locked="0" layoutInCell="1" allowOverlap="1" wp14:anchorId="1662DE94" wp14:editId="6A019C38">
+        <wp:anchor distT="0" distB="0" distL="114300" distR="114300" simplePos="0" relativeHeight="251661312" behindDoc="0" locked="0" layoutInCell="1" allowOverlap="1" wp14:anchorId="487679F5" wp14:editId="043184A6">
           <wp:simplePos x="0" y="0"/>
           <wp:positionH relativeFrom="column">
             <wp:posOffset>-749916</wp:posOffset>
@@ -39440,7 +39450,7 @@
 </file>
 
 <file path=word/numbering.xml><?xml version="1.0" encoding="utf-8"?>
-<w:numbering xmlns:wpc="http://schemas.microsoft.com/office/word/2010/wordprocessingCanvas" xmlns:cx="http://schemas.microsoft.com/office/drawing/2014/chartex" xmlns:mc="http://schemas.openxmlformats.org/markup-compatibility/2006" xmlns:o="urn:schemas-microsoft-com:office:office" xmlns:r="http://schemas.openxmlformats.org/officeDocument/2006/relationships" xmlns:m="http://schemas.openxmlformats.org/officeDocument/2006/math" xmlns:v="urn:schemas-microsoft-com:vml" xmlns:wp14="http://schemas.microsoft.com/office/word/2010/wordprocessingDrawing" xmlns:wp="http://schemas.openxmlformats.org/drawingml/2006/wordprocessingDrawing" xmlns:w10="urn:schemas-microsoft-com:office:word" xmlns:w="http://schemas.openxmlformats.org/wordprocessingml/2006/main" xmlns:w14="http://schemas.microsoft.com/office/word/2010/wordml" xmlns:w15="http://schemas.microsoft.com/office/word/2012/wordml" xmlns:w16se="http://schemas.microsoft.com/office/word/2015/wordml/symex" xmlns:wpg="http://schemas.microsoft.com/office/word/2010/wordprocessingGroup" xmlns:wpi="http://schemas.microsoft.com/office/word/2010/wordprocessingInk" xmlns:wne="http://schemas.microsoft.com/office/word/2006/wordml" xmlns:wps="http://schemas.microsoft.com/office/word/2010/wordprocessingShape" mc:Ignorable="w14 w15 w16se wp14">
+<w:numbering xmlns:wpc="http://schemas.microsoft.com/office/word/2010/wordprocessingCanvas" xmlns:cx="http://schemas.microsoft.com/office/drawing/2014/chartex" xmlns:cx1="http://schemas.microsoft.com/office/drawing/2015/9/8/chartex" xmlns:cx2="http://schemas.microsoft.com/office/drawing/2015/10/21/chartex" xmlns:cx3="http://schemas.microsoft.com/office/drawing/2016/5/9/chartex" xmlns:cx4="http://schemas.microsoft.com/office/drawing/2016/5/10/chartex" xmlns:cx5="http://schemas.microsoft.com/office/drawing/2016/5/11/chartex" xmlns:cx6="http://schemas.microsoft.com/office/drawing/2016/5/12/chartex" xmlns:cx7="http://schemas.microsoft.com/office/drawing/2016/5/13/chartex" xmlns:cx8="http://schemas.microsoft.com/office/drawing/2016/5/14/chartex" xmlns:mc="http://schemas.openxmlformats.org/markup-compatibility/2006" xmlns:aink="http://schemas.microsoft.com/office/drawing/2016/ink" xmlns:am3d="http://schemas.microsoft.com/office/drawing/2017/model3d" xmlns:o="urn:schemas-microsoft-com:office:office" xmlns:r="http://schemas.openxmlformats.org/officeDocument/2006/relationships" xmlns:m="http://schemas.openxmlformats.org/officeDocument/2006/math" xmlns:v="urn:schemas-microsoft-com:vml" xmlns:wp14="http://schemas.microsoft.com/office/word/2010/wordprocessingDrawing" xmlns:wp="http://schemas.openxmlformats.org/drawingml/2006/wordprocessingDrawing" xmlns:w10="urn:schemas-microsoft-com:office:word" xmlns:w="http://schemas.openxmlformats.org/wordprocessingml/2006/main" xmlns:w14="http://schemas.microsoft.com/office/word/2010/wordml" xmlns:w15="http://schemas.microsoft.com/office/word/2012/wordml" xmlns:w16cex="http://schemas.microsoft.com/office/word/2018/wordml/cex" xmlns:w16cid="http://schemas.microsoft.com/office/word/2016/wordml/cid" xmlns:w16="http://schemas.microsoft.com/office/word/2018/wordml" xmlns:w16sdtdh="http://schemas.microsoft.com/office/word/2020/wordml/sdtdatahash" xmlns:w16se="http://schemas.microsoft.com/office/word/2015/wordml/symex" xmlns:wpg="http://schemas.microsoft.com/office/word/2010/wordprocessingGroup" xmlns:wpi="http://schemas.microsoft.com/office/word/2010/wordprocessingInk" xmlns:wne="http://schemas.microsoft.com/office/word/2006/wordml" xmlns:wps="http://schemas.microsoft.com/office/word/2010/wordprocessingShape" mc:Ignorable="w14 w15 w16se w16cid w16 w16cex w16sdtdh wp14">
   <w:abstractNum w:abstractNumId="0" w15:restartNumberingAfterBreak="0">
     <w:nsid w:val="00236ACD"/>
     <w:multiLevelType w:val="multilevel"/>
@@ -48145,7 +48155,7 @@
 </file>
 
 <file path=word/styles.xml><?xml version="1.0" encoding="utf-8"?>
-<w:styles xmlns:mc="http://schemas.openxmlformats.org/markup-compatibility/2006" xmlns:r="http://schemas.openxmlformats.org/officeDocument/2006/relationships" xmlns:w="http://schemas.openxmlformats.org/wordprocessingml/2006/main" xmlns:w14="http://schemas.microsoft.com/office/word/2010/wordml" xmlns:w15="http://schemas.microsoft.com/office/word/2012/wordml" xmlns:w16se="http://schemas.microsoft.com/office/word/2015/wordml/symex" mc:Ignorable="w14 w15 w16se">
+<w:styles xmlns:mc="http://schemas.openxmlformats.org/markup-compatibility/2006" xmlns:r="http://schemas.openxmlformats.org/officeDocument/2006/relationships" xmlns:w="http://schemas.openxmlformats.org/wordprocessingml/2006/main" xmlns:w14="http://schemas.microsoft.com/office/word/2010/wordml" xmlns:w15="http://schemas.microsoft.com/office/word/2012/wordml" xmlns:w16cex="http://schemas.microsoft.com/office/word/2018/wordml/cex" xmlns:w16cid="http://schemas.microsoft.com/office/word/2016/wordml/cid" xmlns:w16="http://schemas.microsoft.com/office/word/2018/wordml" xmlns:w16sdtdh="http://schemas.microsoft.com/office/word/2020/wordml/sdtdatahash" xmlns:w16se="http://schemas.microsoft.com/office/word/2015/wordml/symex" mc:Ignorable="w14 w15 w16se w16cid w16 w16cex w16sdtdh">
   <w:docDefaults>
     <w:rPrDefault>
       <w:rPr>
@@ -48161,7 +48171,7 @@
       </w:pPr>
     </w:pPrDefault>
   </w:docDefaults>
-  <w:latentStyles w:defLockedState="0" w:defUIPriority="99" w:defSemiHidden="0" w:defUnhideWhenUsed="0" w:defQFormat="0" w:count="371">
+  <w:latentStyles w:defLockedState="0" w:defUIPriority="99" w:defSemiHidden="0" w:defUnhideWhenUsed="0" w:defQFormat="0" w:count="376">
     <w:lsdException w:name="Normal" w:uiPriority="0" w:qFormat="1"/>
     <w:lsdException w:name="heading 1" w:uiPriority="9" w:qFormat="1"/>
     <w:lsdException w:name="heading 2" w:semiHidden="1" w:uiPriority="9" w:unhideWhenUsed="1" w:qFormat="1"/>
@@ -48267,7 +48277,6 @@
     <w:lsdException w:name="HTML Sample" w:semiHidden="1" w:unhideWhenUsed="1"/>
     <w:lsdException w:name="HTML Typewriter" w:semiHidden="1" w:unhideWhenUsed="1"/>
     <w:lsdException w:name="HTML Variable" w:semiHidden="1" w:unhideWhenUsed="1"/>
-    <w:lsdException w:name="Normal Table" w:semiHidden="1" w:unhideWhenUsed="1"/>
     <w:lsdException w:name="annotation subject" w:semiHidden="1" w:unhideWhenUsed="1"/>
     <w:lsdException w:name="No List" w:semiHidden="1" w:unhideWhenUsed="1"/>
     <w:lsdException w:name="Outline List 1" w:semiHidden="1" w:unhideWhenUsed="1"/>
@@ -48310,11 +48319,8 @@
     <w:lsdException w:name="Table Contemporary" w:semiHidden="1" w:unhideWhenUsed="1"/>
     <w:lsdException w:name="Table Elegant" w:semiHidden="1" w:unhideWhenUsed="1"/>
     <w:lsdException w:name="Table Professional" w:semiHidden="1" w:unhideWhenUsed="1"/>
-    <w:lsdException w:name="Table Subtle 1" w:semiHidden="1" w:unhideWhenUsed="1"/>
     <w:lsdException w:name="Table Subtle 2" w:semiHidden="1" w:unhideWhenUsed="1"/>
     <w:lsdException w:name="Table Web 1" w:semiHidden="1" w:unhideWhenUsed="1"/>
-    <w:lsdException w:name="Table Web 2" w:semiHidden="1" w:unhideWhenUsed="1"/>
-    <w:lsdException w:name="Table Web 3" w:semiHidden="1" w:unhideWhenUsed="1"/>
     <w:lsdException w:name="Balloon Text" w:semiHidden="1" w:unhideWhenUsed="1"/>
     <w:lsdException w:name="Table Grid" w:uiPriority="39"/>
     <w:lsdException w:name="Table Theme" w:semiHidden="1" w:unhideWhenUsed="1"/>
@@ -48533,6 +48539,11 @@
     <w:lsdException w:name="List Table 5 Dark Accent 6" w:uiPriority="50"/>
     <w:lsdException w:name="List Table 6 Colorful Accent 6" w:uiPriority="51"/>
     <w:lsdException w:name="List Table 7 Colorful Accent 6" w:uiPriority="52"/>
+    <w:lsdException w:name="Mention" w:semiHidden="1" w:unhideWhenUsed="1"/>
+    <w:lsdException w:name="Smart Hyperlink" w:semiHidden="1" w:unhideWhenUsed="1"/>
+    <w:lsdException w:name="Hashtag" w:semiHidden="1" w:unhideWhenUsed="1"/>
+    <w:lsdException w:name="Unresolved Mention" w:semiHidden="1" w:unhideWhenUsed="1"/>
+    <w:lsdException w:name="Smart Link" w:semiHidden="1" w:unhideWhenUsed="1"/>
   </w:latentStyles>
   <w:style w:type="paragraph" w:default="1" w:styleId="Normal">
     <w:name w:val="Normal"/>
@@ -48546,7 +48557,7 @@
     <w:link w:val="Ttulo1Car"/>
     <w:uiPriority w:val="9"/>
     <w:qFormat/>
-    <w:rsid w:val="00DD0FDF"/>
+    <w:rsid w:val="000D31FE"/>
     <w:pPr>
       <w:keepNext/>
       <w:keepLines/>
@@ -48555,7 +48566,8 @@
     </w:pPr>
     <w:rPr>
       <w:rFonts w:asciiTheme="majorHAnsi" w:eastAsiaTheme="majorEastAsia" w:hAnsiTheme="majorHAnsi" w:cstheme="majorBidi"/>
-      <w:color w:val="2E74B5" w:themeColor="accent1" w:themeShade="BF"/>
+      <w:b/>
+      <w:color w:val="9900CC"/>
       <w:sz w:val="32"/>
       <w:szCs w:val="32"/>
     </w:rPr>
@@ -48568,7 +48580,7 @@
     <w:uiPriority w:val="9"/>
     <w:unhideWhenUsed/>
     <w:qFormat/>
-    <w:rsid w:val="000E27C6"/>
+    <w:rsid w:val="000D31FE"/>
     <w:pPr>
       <w:keepNext/>
       <w:keepLines/>
@@ -48577,7 +48589,7 @@
     </w:pPr>
     <w:rPr>
       <w:rFonts w:asciiTheme="majorHAnsi" w:eastAsiaTheme="majorEastAsia" w:hAnsiTheme="majorHAnsi" w:cstheme="majorBidi"/>
-      <w:color w:val="2E74B5" w:themeColor="accent1" w:themeShade="BF"/>
+      <w:color w:val="9900CC"/>
       <w:sz w:val="26"/>
       <w:szCs w:val="26"/>
     </w:rPr>
@@ -48589,7 +48601,7 @@
     <w:link w:val="Ttulo3Car"/>
     <w:uiPriority w:val="9"/>
     <w:qFormat/>
-    <w:rsid w:val="00E548FF"/>
+    <w:rsid w:val="000D31FE"/>
     <w:pPr>
       <w:spacing w:before="100" w:beforeAutospacing="1" w:after="100" w:afterAutospacing="1" w:line="240" w:lineRule="auto"/>
       <w:outlineLvl w:val="2"/>
@@ -48673,10 +48685,11 @@
     <w:basedOn w:val="Fuentedeprrafopredeter"/>
     <w:link w:val="Ttulo1"/>
     <w:uiPriority w:val="9"/>
-    <w:rsid w:val="00DD0FDF"/>
+    <w:rsid w:val="000D31FE"/>
     <w:rPr>
       <w:rFonts w:asciiTheme="majorHAnsi" w:eastAsiaTheme="majorEastAsia" w:hAnsiTheme="majorHAnsi" w:cstheme="majorBidi"/>
-      <w:color w:val="2E74B5" w:themeColor="accent1" w:themeShade="BF"/>
+      <w:b/>
+      <w:color w:val="9900CC"/>
       <w:sz w:val="32"/>
       <w:szCs w:val="32"/>
     </w:rPr>
@@ -48686,10 +48699,10 @@
     <w:basedOn w:val="Fuentedeprrafopredeter"/>
     <w:link w:val="Ttulo2"/>
     <w:uiPriority w:val="9"/>
-    <w:rsid w:val="000E27C6"/>
+    <w:rsid w:val="000D31FE"/>
     <w:rPr>
       <w:rFonts w:asciiTheme="majorHAnsi" w:eastAsiaTheme="majorEastAsia" w:hAnsiTheme="majorHAnsi" w:cstheme="majorBidi"/>
-      <w:color w:val="2E74B5" w:themeColor="accent1" w:themeShade="BF"/>
+      <w:color w:val="9900CC"/>
       <w:sz w:val="26"/>
       <w:szCs w:val="26"/>
     </w:rPr>
@@ -48699,11 +48712,11 @@
     <w:basedOn w:val="Fuentedeprrafopredeter"/>
     <w:link w:val="Ttulo3"/>
     <w:uiPriority w:val="9"/>
-    <w:rsid w:val="00E548FF"/>
+    <w:rsid w:val="000D31FE"/>
     <w:rPr>
       <w:rFonts w:asciiTheme="majorHAnsi" w:eastAsia="Times New Roman" w:hAnsiTheme="majorHAnsi" w:cs="Times New Roman"/>
       <w:bCs/>
-      <w:color w:val="2E74B5" w:themeColor="accent1" w:themeShade="BF"/>
+      <w:color w:val="9900CC"/>
       <w:sz w:val="26"/>
       <w:szCs w:val="27"/>
       <w:lang w:eastAsia="es-AR"/>
@@ -49011,7 +49024,7 @@
   </w:style>
   <w:style w:type="table" w:customStyle="1" w:styleId="Estilo1">
     <w:name w:val="Estilo1"/>
-    <w:basedOn w:val="Cuadrculadetablaclara"/>
+    <w:basedOn w:val="Tablaconcuadrculaclara"/>
     <w:uiPriority w:val="99"/>
     <w:rsid w:val="00A96F89"/>
     <w:tblPr>
@@ -49043,7 +49056,7 @@
       </w:tcPr>
     </w:tblStylePr>
   </w:style>
-  <w:style w:type="table" w:styleId="Cuadrculadetablaclara">
+  <w:style w:type="table" w:styleId="Tablaconcuadrculaclara">
     <w:name w:val="Grid Table Light"/>
     <w:basedOn w:val="Tablanormal"/>
     <w:uiPriority w:val="40"/>

</xml_diff>